<commit_message>
docs(scrc): v3.1, the owner's decisions on the two proposals
No stretch after POR, adopted: every RRC flip-flop, CNT included, resets
to 0 and w_rst_n_sys releases one cycle after w_rst_n_por; every domain is
still held by RST_REL = 0 until the power-up program. The 16-cycle stretch
stays for WDT and SW. SCRC_RST_001 updated.

Two CSRs instead of APB BUS + WFs, rejected: the mentor's design stays.
The APB BUS name-clash item keeps only the rename of the generated module.
</commit_message>
<xml_diff>
--- a/doc/specs/docx/QNSC_SCRC_MAS.docx
+++ b/doc/specs/docx/QNSC_SCRC_MAS.docx
@@ -15,7 +15,7 @@
         <w:pStyle w:val="Subtitle"/>
       </w:pPr>
       <w:r>
-        <w:t xml:space="preserve">MICRO-ARCHITECTURE SPECIFICATION – V3.0</w:t>
+        <w:t xml:space="preserve">MICRO-ARCHITECTURE SPECIFICATION – V3.1</w:t>
       </w:r>
     </w:p>
     <w:p>
@@ -603,6 +603,80 @@
           </w:p>
         </w:tc>
       </w:tr>
+      <w:tr>
+        <w:tc>
+          <w:tcPr/>
+          <w:p>
+            <w:pPr>
+              <w:pStyle w:val="Compact"/>
+              <w:jc w:val="left"/>
+            </w:pPr>
+            <w:r>
+              <w:t xml:space="preserve">V3.1</w:t>
+            </w:r>
+          </w:p>
+        </w:tc>
+        <w:tc>
+          <w:tcPr/>
+          <w:p>
+            <w:pPr>
+              <w:pStyle w:val="Compact"/>
+              <w:jc w:val="left"/>
+            </w:pPr>
+            <w:r>
+              <w:t xml:space="preserve">2026-09-28</w:t>
+            </w:r>
+          </w:p>
+        </w:tc>
+        <w:tc>
+          <w:tcPr/>
+          <w:p>
+            <w:pPr>
+              <w:pStyle w:val="Compact"/>
+              <w:jc w:val="left"/>
+            </w:pPr>
+            <w:r>
+              <w:t xml:space="preserve">Nghia VT (lead), for Nguyen Hao Nam</w:t>
+            </w:r>
+          </w:p>
+        </w:tc>
+        <w:tc>
+          <w:tcPr/>
+          <w:p>
+            <w:pPr>
+              <w:pStyle w:val="Compact"/>
+              <w:jc w:val="left"/>
+            </w:pPr>
+            <w:r>
+              <w:t xml:space="preserve">–</w:t>
+            </w:r>
+          </w:p>
+        </w:tc>
+        <w:tc>
+          <w:tcPr/>
+          <w:p>
+            <w:pPr>
+              <w:pStyle w:val="Compact"/>
+              <w:jc w:val="left"/>
+            </w:pPr>
+            <w:r>
+              <w:t xml:space="preserve">Owner decisions on the two proposals: no stretch after POR, adopted (7.3,</w:t>
+            </w:r>
+            <w:r>
+              <w:t xml:space="preserve"> </w:t>
+            </w:r>
+            <w:r>
+              <w:rPr>
+                <w:rStyle w:val="VerbatimChar"/>
+              </w:rPr>
+              <w:t xml:space="preserve">SCRC_RST_001</w:t>
+            </w:r>
+            <w:r>
+              <w:t xml:space="preserve">); two CSRs, rejected, the mentor’s APB BUS and WFs stay. Open item on the APB BUS name narrowed to renaming the generated module</w:t>
+            </w:r>
+          </w:p>
+        </w:tc>
+      </w:tr>
     </w:tbl>
     <w:bookmarkEnd w:id="26"/>
     <w:bookmarkStart w:id="27" w:name="overview"/>
@@ -928,7 +1002,19 @@
         <w:t xml:space="preserve"> </w:t>
       </w:r>
       <w:r>
-        <w:t xml:space="preserve">16-cycle chip reset, with the cause reported to</w:t>
+        <w:t xml:space="preserve">chip reset, 16 cycles after a WDT bite or</w:t>
+      </w:r>
+      <w:r>
+        <w:t xml:space="preserve"> </w:t>
+      </w:r>
+      <w:r>
+        <w:rPr>
+          <w:rStyle w:val="VerbatimChar"/>
+        </w:rPr>
+        <w:t xml:space="preserve">SW_RST</w:t>
+      </w:r>
+      <w:r>
+        <w:t xml:space="preserve">, with the cause reported to</w:t>
       </w:r>
       <w:r>
         <w:t xml:space="preserve"> </w:t>
@@ -8663,7 +8749,22 @@
         <w:t xml:space="preserve"> </w:t>
       </w:r>
       <w:r>
-        <w:t xml:space="preserve">flip-flop is reset by</w:t>
+        <w:t xml:space="preserve">flip-flop,</w:t>
+      </w:r>
+      <w:r>
+        <w:t xml:space="preserve"> </w:t>
+      </w:r>
+      <w:r>
+        <w:rPr>
+          <w:rStyle w:val="VerbatimChar"/>
+        </w:rPr>
+        <w:t xml:space="preserve">CNT</w:t>
+      </w:r>
+      <w:r>
+        <w:t xml:space="preserve"> </w:t>
+      </w:r>
+      <w:r>
+        <w:t xml:space="preserve">included, is reset to 0 by</w:t>
       </w:r>
       <w:r>
         <w:t xml:space="preserve"> </w:t>
@@ -9160,22 +9261,7 @@
         <w:jc w:val="left"/>
       </w:pPr>
       <w:r>
-        <w:t xml:space="preserve">On power-on,</w:t>
-      </w:r>
-      <w:r>
-        <w:t xml:space="preserve"> </w:t>
-      </w:r>
-      <w:r>
-        <w:rPr>
-          <w:rStyle w:val="VerbatimChar"/>
-        </w:rPr>
-        <w:t xml:space="preserve">CNT</w:t>
-      </w:r>
-      <w:r>
-        <w:t xml:space="preserve"> </w:t>
-      </w:r>
-      <w:r>
-        <w:t xml:space="preserve">resets to 15 and the flip-flop to 0:</w:t>
+        <w:t xml:space="preserve">On power-on there is no stretch:</w:t>
       </w:r>
       <w:r>
         <w:t xml:space="preserve"> </w:t>
@@ -9190,13 +9276,7 @@
         <w:t xml:space="preserve"> </w:t>
       </w:r>
       <w:r>
-        <w:t xml:space="preserve">releases</w:t>
-      </w:r>
-      <w:r>
-        <w:t xml:space="preserve"> </w:t>
-      </w:r>
-      <w:r>
-        <w:t xml:space="preserve">16 cycles after</w:t>
+        <w:t xml:space="preserve">releases one cycle after</w:t>
       </w:r>
       <w:r>
         <w:t xml:space="preserve"> </w:t>
@@ -9208,7 +9288,22 @@
         <w:t xml:space="preserve">w_rst_n_por</w:t>
       </w:r>
       <w:r>
-        <w:t xml:space="preserve">.</w:t>
+        <w:t xml:space="preserve">. None is needed, because every domain stays in reset through</w:t>
+      </w:r>
+      <w:r>
+        <w:t xml:space="preserve"> </w:t>
+      </w:r>
+      <w:r>
+        <w:rPr>
+          <w:rStyle w:val="VerbatimChar"/>
+        </w:rPr>
+        <w:t xml:space="preserve">RST_REL</w:t>
+      </w:r>
+      <w:r>
+        <w:t xml:space="preserve"> </w:t>
+      </w:r>
+      <w:r>
+        <w:t xml:space="preserve">= 0 until the program of 7.5 releases it.</w:t>
       </w:r>
     </w:p>
     <w:p>
@@ -15543,13 +15638,31 @@
         <w:t xml:space="preserve"> </w:t>
       </w:r>
       <w:r>
-        <w:t xml:space="preserve">and the name fails Naming Rule 2.1. Options: rename the generated files, or</w:t>
-      </w:r>
-      <w:r>
-        <w:t xml:space="preserve"> </w:t>
-      </w:r>
-      <w:r>
-        <w:t xml:space="preserve">replace the 2:1 bus with a hand-written arbiter. SCRC owner with the bus owner.</w:t>
+        <w:t xml:space="preserve">and the name fails Naming Rule 2.1. The generator stays (the mentor’s design);</w:t>
+      </w:r>
+      <w:r>
+        <w:t xml:space="preserve"> </w:t>
+      </w:r>
+      <w:r>
+        <w:t xml:space="preserve">the generated module is renamed when it is committed to</w:t>
+      </w:r>
+      <w:r>
+        <w:t xml:space="preserve"> </w:t>
+      </w:r>
+      <w:r>
+        <w:rPr>
+          <w:rStyle w:val="VerbatimChar"/>
+        </w:rPr>
+        <w:t xml:space="preserve">util/gen</w:t>
+      </w:r>
+      <w:r>
+        <w:t xml:space="preserve">, with the</w:t>
+      </w:r>
+      <w:r>
+        <w:t xml:space="preserve"> </w:t>
+      </w:r>
+      <w:r>
+        <w:t xml:space="preserve">command. SCRC owner with the bus owner.</w:t>
       </w:r>
     </w:p>
     <w:p>
@@ -15621,13 +15734,7 @@
         <w:pStyle w:val="FirstParagraph"/>
       </w:pPr>
       <w:r>
-        <w:t xml:space="preserve">Proposals under review (SCRC owner; the first also with the mentor), detail in</w:t>
-      </w:r>
-      <w:r>
-        <w:t xml:space="preserve"> </w:t>
-      </w:r>
-      <w:r>
-        <w:t xml:space="preserve">DECISIONS 4. Neither changes any other block, the address map or firmware:</w:t>
+        <w:t xml:space="preserve">Accepted limits:</w:t>
       </w:r>
     </w:p>
     <w:p>
@@ -15640,107 +15747,22 @@
         <w:jc w:val="left"/>
       </w:pPr>
       <w:r>
-        <w:rPr>
-          <w:b/>
-          <w:bCs/>
-        </w:rPr>
-        <w:t xml:space="preserve">Two CSRs instead of APB BUS + WFs.</w:t>
-      </w:r>
-      <w:r>
-        <w:t xml:space="preserve"> </w:t>
-      </w:r>
-      <w:r>
-        <w:rPr>
-          <w:rStyle w:val="VerbatimChar"/>
-        </w:rPr>
-        <w:t xml:space="preserve">CSR_I</w:t>
-      </w:r>
-      <w:r>
-        <w:t xml:space="preserve"> </w:t>
-      </w:r>
-      <w:r>
-        <w:t xml:space="preserve">on</w:t>
-      </w:r>
-      <w:r>
-        <w:t xml:space="preserve"> </w:t>
-      </w:r>
-      <w:r>
-        <w:rPr>
-          <w:rStyle w:val="VerbatimChar"/>
-        </w:rPr>
-        <w:t xml:space="preserve">APB_M0</w:t>
-      </w:r>
-      <w:r>
-        <w:t xml:space="preserve">,</w:t>
-      </w:r>
-      <w:r>
-        <w:t xml:space="preserve"> </w:t>
-      </w:r>
-      <w:r>
-        <w:rPr>
-          <w:rStyle w:val="VerbatimChar"/>
-        </w:rPr>
-        <w:t xml:space="preserve">CSR_M</w:t>
-      </w:r>
-      <w:r>
-        <w:t xml:space="preserve"> </w:t>
-      </w:r>
-      <w:r>
-        <w:t xml:space="preserve">on</w:t>
-      </w:r>
-      <w:r>
-        <w:t xml:space="preserve"> </w:t>
-      </w:r>
-      <w:r>
-        <w:rPr>
-          <w:rStyle w:val="VerbatimChar"/>
-        </w:rPr>
-        <w:t xml:space="preserve">MCPU</w:t>
-      </w:r>
-      <w:r>
-        <w:t xml:space="preserve">,</w:t>
-      </w:r>
-      <w:r>
-        <w:t xml:space="preserve"> </w:t>
-      </w:r>
-      <w:r>
-        <w:t xml:space="preserve">each writable only by its master; the other side’s fields appear as</w:t>
-      </w:r>
-      <w:r>
-        <w:t xml:space="preserve"> </w:t>
-      </w:r>
-      <w:r>
-        <w:rPr>
-          <w:rStyle w:val="VerbatimChar"/>
-        </w:rPr>
-        <w:t xml:space="preserve">ro</w:t>
-      </w:r>
-      <w:r>
-        <w:t xml:space="preserve">. Removes</w:t>
-      </w:r>
-      <w:r>
-        <w:t xml:space="preserve"> </w:t>
-      </w:r>
-      <w:r>
-        <w:t xml:space="preserve">the APB BUS, both WFs and the name clash above. A wrong-side write is then</w:t>
-      </w:r>
-      <w:r>
-        <w:t xml:space="preserve"> </w:t>
-      </w:r>
-      <w:r>
-        <w:t xml:space="preserve">ignored instead of answered with</w:t>
-      </w:r>
-      <w:r>
-        <w:t xml:space="preserve"> </w:t>
-      </w:r>
-      <w:r>
-        <w:rPr>
-          <w:rStyle w:val="VerbatimChar"/>
-        </w:rPr>
-        <w:t xml:space="preserve">PSLVERR</w:t>
-      </w:r>
-      <w:r>
-        <w:t xml:space="preserve">.</w:t>
+        <w:t xml:space="preserve">One domain serves both SPI blocks: gating</w:t>
+      </w:r>
+      <w:r>
+        <w:t xml:space="preserve"> </w:t>
+      </w:r>
+      <w:r>
+        <w:rPr>
+          <w:rStyle w:val="VerbatimChar"/>
+        </w:rPr>
+        <w:t xml:space="preserve">spi</w:t>
+      </w:r>
+      <w:r>
+        <w:t xml:space="preserve"> </w:t>
+      </w:r>
+      <w:r>
+        <w:t xml:space="preserve">stops SPI Host and SPI Device together.</w:t>
       </w:r>
     </w:p>
     <w:p>
@@ -15753,67 +15775,139 @@
         <w:jc w:val="left"/>
       </w:pPr>
       <w:r>
-        <w:rPr>
-          <w:b/>
-          <w:bCs/>
-        </w:rPr>
-        <w:t xml:space="preserve">No stretch after POR.</w:t>
-      </w:r>
-      <w:r>
-        <w:t xml:space="preserve"> </w:t>
-      </w:r>
-      <w:r>
-        <w:t xml:space="preserve">Every</w:t>
-      </w:r>
-      <w:r>
-        <w:t xml:space="preserve"> </w:t>
-      </w:r>
-      <w:r>
-        <w:rPr>
-          <w:rStyle w:val="VerbatimChar"/>
-        </w:rPr>
-        <w:t xml:space="preserve">RRC</w:t>
-      </w:r>
-      <w:r>
-        <w:t xml:space="preserve"> </w:t>
-      </w:r>
-      <w:r>
-        <w:t xml:space="preserve">flip-flop resets to 0;</w:t>
-      </w:r>
-      <w:r>
-        <w:t xml:space="preserve"> </w:t>
-      </w:r>
-      <w:r>
-        <w:rPr>
-          <w:rStyle w:val="VerbatimChar"/>
-        </w:rPr>
-        <w:t xml:space="preserve">w_rst_n_sys</w:t>
-      </w:r>
-      <w:r>
-        <w:t xml:space="preserve"> </w:t>
-      </w:r>
-      <w:r>
-        <w:t xml:space="preserve">releases one cycle after</w:t>
-      </w:r>
-      <w:r>
-        <w:t xml:space="preserve"> </w:t>
-      </w:r>
-      <w:r>
-        <w:rPr>
-          <w:rStyle w:val="VerbatimChar"/>
-        </w:rPr>
-        <w:t xml:space="preserve">w_rst_n_por</w:t>
-      </w:r>
-      <w:r>
-        <w:t xml:space="preserve">. The 16-cycle stretch stays for WDT and SW.</w:t>
+        <w:t xml:space="preserve">Gating</w:t>
+      </w:r>
+      <w:r>
+        <w:t xml:space="preserve"> </w:t>
+      </w:r>
+      <w:r>
+        <w:rPr>
+          <w:rStyle w:val="VerbatimChar"/>
+        </w:rPr>
+        <w:t xml:space="preserve">spi</w:t>
+      </w:r>
+      <w:r>
+        <w:t xml:space="preserve"> </w:t>
+      </w:r>
+      <w:r>
+        <w:t xml:space="preserve">while an external host drives SPI Device</w:t>
+      </w:r>
+      <w:r>
+        <w:t xml:space="preserve"> </w:t>
+      </w:r>
+      <w:r>
+        <w:rPr>
+          <w:rStyle w:val="VerbatimChar"/>
+        </w:rPr>
+        <w:t xml:space="preserve">SCK</w:t>
+      </w:r>
+      <w:r>
+        <w:t xml:space="preserve"> </w:t>
+      </w:r>
+      <w:r>
+        <w:t xml:space="preserve">loses that transfer: SPI Device needs its core clock at &gt;= 1/4 of</w:t>
+      </w:r>
+      <w:r>
+        <w:t xml:space="preserve"> </w:t>
+      </w:r>
+      <w:r>
+        <w:rPr>
+          <w:rStyle w:val="VerbatimChar"/>
+        </w:rPr>
+        <w:t xml:space="preserve">SCK</w:t>
+      </w:r>
+      <w:r>
+        <w:t xml:space="preserve">.</w:t>
       </w:r>
     </w:p>
     <w:p>
       <w:pPr>
-        <w:pStyle w:val="FirstParagraph"/>
-      </w:pPr>
-      <w:r>
-        <w:t xml:space="preserve">Accepted limits:</w:t>
+        <w:pStyle w:val="Compact"/>
+        <w:numPr>
+          <w:ilvl w:val="0"/>
+          <w:numId w:val="1013"/>
+        </w:numPr>
+        <w:jc w:val="left"/>
+      </w:pPr>
+      <w:r>
+        <w:t xml:space="preserve">The</w:t>
+      </w:r>
+      <w:r>
+        <w:t xml:space="preserve"> </w:t>
+      </w:r>
+      <w:r>
+        <w:rPr>
+          <w:rStyle w:val="VerbatimChar"/>
+        </w:rPr>
+        <w:t xml:space="preserve">dma</w:t>
+      </w:r>
+      <w:r>
+        <w:t xml:space="preserve"> </w:t>
+      </w:r>
+      <w:r>
+        <w:t xml:space="preserve">guard covers the configuration port only, not DMA transfers already</w:t>
+      </w:r>
+      <w:r>
+        <w:t xml:space="preserve"> </w:t>
+      </w:r>
+      <w:r>
+        <w:t xml:space="preserve">issued on</w:t>
+      </w:r>
+      <w:r>
+        <w:t xml:space="preserve"> </w:t>
+      </w:r>
+      <w:r>
+        <w:rPr>
+          <w:rStyle w:val="VerbatimChar"/>
+        </w:rPr>
+        <w:t xml:space="preserve">S_BUS</w:t>
+      </w:r>
+      <w:r>
+        <w:t xml:space="preserve">.</w:t>
+      </w:r>
+    </w:p>
+    <w:p>
+      <w:pPr>
+        <w:pStyle w:val="Compact"/>
+        <w:numPr>
+          <w:ilvl w:val="0"/>
+          <w:numId w:val="1013"/>
+        </w:numPr>
+        <w:jc w:val="left"/>
+      </w:pPr>
+      <w:r>
+        <w:t xml:space="preserve">A peripheral that holds</w:t>
+      </w:r>
+      <w:r>
+        <w:t xml:space="preserve"> </w:t>
+      </w:r>
+      <w:r>
+        <w:rPr>
+          <w:rStyle w:val="VerbatimChar"/>
+        </w:rPr>
+        <w:t xml:space="preserve">PREADY</w:t>
+      </w:r>
+      <w:r>
+        <w:t xml:space="preserve"> </w:t>
+      </w:r>
+      <w:r>
+        <w:t xml:space="preserve">low while not blocked stalls Ibex; only the</w:t>
+      </w:r>
+      <w:r>
+        <w:t xml:space="preserve"> </w:t>
+      </w:r>
+      <w:r>
+        <w:t xml:space="preserve">watchdog recovers it.</w:t>
+      </w:r>
+    </w:p>
+    <w:bookmarkEnd w:id="83"/>
+    <w:bookmarkStart w:id="84" w:name="verification"/>
+    <w:p>
+      <w:pPr>
+        <w:pStyle w:val="Heading1"/>
+      </w:pPr>
+      <w:r>
+        <w:t xml:space="preserve">12. Verification</w:t>
       </w:r>
     </w:p>
     <w:p>
@@ -15826,22 +15920,31 @@
         <w:jc w:val="left"/>
       </w:pPr>
       <w:r>
-        <w:t xml:space="preserve">One domain serves both SPI blocks: gating</w:t>
-      </w:r>
-      <w:r>
-        <w:t xml:space="preserve"> </w:t>
-      </w:r>
-      <w:r>
-        <w:rPr>
-          <w:rStyle w:val="VerbatimChar"/>
-        </w:rPr>
-        <w:t xml:space="preserve">spi</w:t>
-      </w:r>
-      <w:r>
-        <w:t xml:space="preserve"> </w:t>
-      </w:r>
-      <w:r>
-        <w:t xml:space="preserve">stops SPI Host and SPI Device together.</w:t>
+        <w:rPr>
+          <w:rStyle w:val="VerbatimChar"/>
+        </w:rPr>
+        <w:t xml:space="preserve">SCRC_CLK_001</w:t>
+      </w:r>
+      <w:r>
+        <w:t xml:space="preserve"> </w:t>
+      </w:r>
+      <w:r>
+        <w:t xml:space="preserve">Every output clock equals the root clock while its</w:t>
+      </w:r>
+      <w:r>
+        <w:t xml:space="preserve"> </w:t>
+      </w:r>
+      <w:r>
+        <w:rPr>
+          <w:rStyle w:val="VerbatimChar"/>
+        </w:rPr>
+        <w:t xml:space="preserve">CTRL</w:t>
+      </w:r>
+      <w:r>
+        <w:t xml:space="preserve"> </w:t>
+      </w:r>
+      <w:r>
+        <w:t xml:space="preserve">is enabled.</w:t>
       </w:r>
     </w:p>
     <w:p>
@@ -15854,49 +15957,31 @@
         <w:jc w:val="left"/>
       </w:pPr>
       <w:r>
-        <w:t xml:space="preserve">Gating</w:t>
-      </w:r>
-      <w:r>
-        <w:t xml:space="preserve"> </w:t>
-      </w:r>
-      <w:r>
-        <w:rPr>
-          <w:rStyle w:val="VerbatimChar"/>
-        </w:rPr>
-        <w:t xml:space="preserve">spi</w:t>
-      </w:r>
-      <w:r>
-        <w:t xml:space="preserve"> </w:t>
-      </w:r>
-      <w:r>
-        <w:t xml:space="preserve">while an external host drives SPI Device</w:t>
-      </w:r>
-      <w:r>
-        <w:t xml:space="preserve"> </w:t>
-      </w:r>
-      <w:r>
-        <w:rPr>
-          <w:rStyle w:val="VerbatimChar"/>
-        </w:rPr>
-        <w:t xml:space="preserve">SCK</w:t>
-      </w:r>
-      <w:r>
-        <w:t xml:space="preserve"> </w:t>
-      </w:r>
-      <w:r>
-        <w:t xml:space="preserve">loses that transfer: SPI Device needs its core clock at &gt;= 1/4 of</w:t>
-      </w:r>
-      <w:r>
-        <w:t xml:space="preserve"> </w:t>
-      </w:r>
-      <w:r>
-        <w:rPr>
-          <w:rStyle w:val="VerbatimChar"/>
-        </w:rPr>
-        <w:t xml:space="preserve">SCK</w:t>
-      </w:r>
-      <w:r>
-        <w:t xml:space="preserve">.</w:t>
+        <w:rPr>
+          <w:rStyle w:val="VerbatimChar"/>
+        </w:rPr>
+        <w:t xml:space="preserve">SCRC_CLK_002</w:t>
+      </w:r>
+      <w:r>
+        <w:t xml:space="preserve"> </w:t>
+      </w:r>
+      <w:r>
+        <w:t xml:space="preserve">The seven always-on clocks,</w:t>
+      </w:r>
+      <w:r>
+        <w:t xml:space="preserve"> </w:t>
+      </w:r>
+      <w:r>
+        <w:rPr>
+          <w:rStyle w:val="VerbatimChar"/>
+        </w:rPr>
+        <w:t xml:space="preserve">wdt</w:t>
+      </w:r>
+      <w:r>
+        <w:t xml:space="preserve"> </w:t>
+      </w:r>
+      <w:r>
+        <w:t xml:space="preserve">included, never stop, for any register value.</w:t>
       </w:r>
     </w:p>
     <w:p>
@@ -15909,37 +15994,25 @@
         <w:jc w:val="left"/>
       </w:pPr>
       <w:r>
-        <w:t xml:space="preserve">The</w:t>
-      </w:r>
-      <w:r>
-        <w:t xml:space="preserve"> </w:t>
-      </w:r>
-      <w:r>
-        <w:rPr>
-          <w:rStyle w:val="VerbatimChar"/>
-        </w:rPr>
-        <w:t xml:space="preserve">dma</w:t>
-      </w:r>
-      <w:r>
-        <w:t xml:space="preserve"> </w:t>
-      </w:r>
-      <w:r>
-        <w:t xml:space="preserve">guard covers the configuration port only, not DMA transfers already</w:t>
-      </w:r>
-      <w:r>
-        <w:t xml:space="preserve"> </w:t>
-      </w:r>
-      <w:r>
-        <w:t xml:space="preserve">issued on</w:t>
-      </w:r>
-      <w:r>
-        <w:t xml:space="preserve"> </w:t>
-      </w:r>
-      <w:r>
-        <w:rPr>
-          <w:rStyle w:val="VerbatimChar"/>
-        </w:rPr>
-        <w:t xml:space="preserve">S_BUS</w:t>
+        <w:rPr>
+          <w:rStyle w:val="VerbatimChar"/>
+        </w:rPr>
+        <w:t xml:space="preserve">SCRC_CLK_003</w:t>
+      </w:r>
+      <w:r>
+        <w:t xml:space="preserve"> </w:t>
+      </w:r>
+      <w:r>
+        <w:t xml:space="preserve">After any chip reset every gateable clock runs except</w:t>
+      </w:r>
+      <w:r>
+        <w:t xml:space="preserve"> </w:t>
+      </w:r>
+      <w:r>
+        <w:rPr>
+          <w:rStyle w:val="VerbatimChar"/>
+        </w:rPr>
+        <w:t xml:space="preserve">timer_1</w:t>
       </w:r>
       <w:r>
         <w:t xml:space="preserve">.</w:t>
@@ -15955,38 +16028,85 @@
         <w:jc w:val="left"/>
       </w:pPr>
       <w:r>
-        <w:t xml:space="preserve">A peripheral that holds</w:t>
-      </w:r>
-      <w:r>
-        <w:t xml:space="preserve"> </w:t>
-      </w:r>
-      <w:r>
-        <w:rPr>
-          <w:rStyle w:val="VerbatimChar"/>
-        </w:rPr>
-        <w:t xml:space="preserve">PREADY</w:t>
-      </w:r>
-      <w:r>
-        <w:t xml:space="preserve"> </w:t>
-      </w:r>
-      <w:r>
-        <w:t xml:space="preserve">low while not blocked stalls Ibex; only the</w:t>
-      </w:r>
-      <w:r>
-        <w:t xml:space="preserve"> </w:t>
-      </w:r>
-      <w:r>
-        <w:t xml:space="preserve">watchdog recovers it.</w:t>
-      </w:r>
-    </w:p>
-    <w:bookmarkEnd w:id="83"/>
-    <w:bookmarkStart w:id="84" w:name="verification"/>
-    <w:p>
-      <w:pPr>
-        <w:pStyle w:val="Heading1"/>
-      </w:pPr>
-      <w:r>
-        <w:t xml:space="preserve">12. Verification</w:t>
+        <w:rPr>
+          <w:rStyle w:val="VerbatimChar"/>
+        </w:rPr>
+        <w:t xml:space="preserve">SCRC_RST_001</w:t>
+      </w:r>
+      <w:r>
+        <w:t xml:space="preserve"> </w:t>
+      </w:r>
+      <w:r>
+        <w:t xml:space="preserve">A WDT bite and</w:t>
+      </w:r>
+      <w:r>
+        <w:t xml:space="preserve"> </w:t>
+      </w:r>
+      <w:r>
+        <w:rPr>
+          <w:rStyle w:val="VerbatimChar"/>
+        </w:rPr>
+        <w:t xml:space="preserve">SW_RST</w:t>
+      </w:r>
+      <w:r>
+        <w:t xml:space="preserve"> </w:t>
+      </w:r>
+      <w:r>
+        <w:t xml:space="preserve">each hold</w:t>
+      </w:r>
+      <w:r>
+        <w:t xml:space="preserve"> </w:t>
+      </w:r>
+      <w:r>
+        <w:rPr>
+          <w:rStyle w:val="VerbatimChar"/>
+        </w:rPr>
+        <w:t xml:space="preserve">w_rst_n_sys</w:t>
+      </w:r>
+      <w:r>
+        <w:t xml:space="preserve"> </w:t>
+      </w:r>
+      <w:r>
+        <w:t xml:space="preserve">low for exactly</w:t>
+      </w:r>
+      <w:r>
+        <w:t xml:space="preserve"> </w:t>
+      </w:r>
+      <w:r>
+        <w:t xml:space="preserve">16 cycles; after POR it releases one cycle after</w:t>
+      </w:r>
+      <w:r>
+        <w:t xml:space="preserve"> </w:t>
+      </w:r>
+      <w:r>
+        <w:rPr>
+          <w:rStyle w:val="VerbatimChar"/>
+        </w:rPr>
+        <w:t xml:space="preserve">w_rst_n_por</w:t>
+      </w:r>
+      <w:r>
+        <w:t xml:space="preserve">. Each asserts</w:t>
+      </w:r>
+      <w:r>
+        <w:t xml:space="preserve"> </w:t>
+      </w:r>
+      <w:r>
+        <w:t xml:space="preserve">every domain reset except</w:t>
+      </w:r>
+      <w:r>
+        <w:t xml:space="preserve"> </w:t>
+      </w:r>
+      <w:r>
+        <w:rPr>
+          <w:rStyle w:val="VerbatimChar"/>
+        </w:rPr>
+        <w:t xml:space="preserve">sysdbg</w:t>
+      </w:r>
+      <w:r>
+        <w:t xml:space="preserve"> </w:t>
+      </w:r>
+      <w:r>
+        <w:t xml:space="preserve">(WDT, SW).</w:t>
       </w:r>
     </w:p>
     <w:p>
@@ -15994,7 +16114,7 @@
         <w:pStyle w:val="Compact"/>
         <w:numPr>
           <w:ilvl w:val="0"/>
-          <w:numId w:val="1015"/>
+          <w:numId w:val="1014"/>
         </w:numPr>
         <w:jc w:val="left"/>
       </w:pPr>
@@ -16002,28 +16122,13 @@
         <w:rPr>
           <w:rStyle w:val="VerbatimChar"/>
         </w:rPr>
-        <w:t xml:space="preserve">SCRC_CLK_001</w:t>
-      </w:r>
-      <w:r>
-        <w:t xml:space="preserve"> </w:t>
-      </w:r>
-      <w:r>
-        <w:t xml:space="preserve">Every output clock equals the root clock while its</w:t>
-      </w:r>
-      <w:r>
-        <w:t xml:space="preserve"> </w:t>
-      </w:r>
-      <w:r>
-        <w:rPr>
-          <w:rStyle w:val="VerbatimChar"/>
-        </w:rPr>
-        <w:t xml:space="preserve">CTRL</w:t>
-      </w:r>
-      <w:r>
-        <w:t xml:space="preserve"> </w:t>
-      </w:r>
-      <w:r>
-        <w:t xml:space="preserve">is enabled.</w:t>
+        <w:t xml:space="preserve">SCRC_RST_002</w:t>
+      </w:r>
+      <w:r>
+        <w:t xml:space="preserve"> </w:t>
+      </w:r>
+      <w:r>
+        <w:t xml:space="preserve">Each domain reset releases 2 domain-clock edges after its input rises.</w:t>
       </w:r>
     </w:p>
     <w:p>
@@ -16031,7 +16136,7 @@
         <w:pStyle w:val="Compact"/>
         <w:numPr>
           <w:ilvl w:val="0"/>
-          <w:numId w:val="1015"/>
+          <w:numId w:val="1014"/>
         </w:numPr>
         <w:jc w:val="left"/>
       </w:pPr>
@@ -16039,28 +16144,34 @@
         <w:rPr>
           <w:rStyle w:val="VerbatimChar"/>
         </w:rPr>
-        <w:t xml:space="preserve">SCRC_CLK_002</w:t>
-      </w:r>
-      <w:r>
-        <w:t xml:space="preserve"> </w:t>
-      </w:r>
-      <w:r>
-        <w:t xml:space="preserve">The seven always-on clocks,</w:t>
-      </w:r>
-      <w:r>
-        <w:t xml:space="preserve"> </w:t>
-      </w:r>
-      <w:r>
-        <w:rPr>
-          <w:rStyle w:val="VerbatimChar"/>
-        </w:rPr>
-        <w:t xml:space="preserve">wdt</w:t>
-      </w:r>
-      <w:r>
-        <w:t xml:space="preserve"> </w:t>
-      </w:r>
-      <w:r>
-        <w:t xml:space="preserve">included, never stop, for any register value.</w:t>
+        <w:t xml:space="preserve">SCRC_RST_003</w:t>
+      </w:r>
+      <w:r>
+        <w:t xml:space="preserve"> </w:t>
+      </w:r>
+      <w:r>
+        <w:t xml:space="preserve">All non-CPU domains release in the same cycle; the CPU releases</w:t>
+      </w:r>
+      <w:r>
+        <w:t xml:space="preserve"> </w:t>
+      </w:r>
+      <w:r>
+        <w:t xml:space="preserve">&gt;= 16 cycles later and after</w:t>
+      </w:r>
+      <w:r>
+        <w:t xml:space="preserve"> </w:t>
+      </w:r>
+      <w:r>
+        <w:rPr>
+          <w:rStyle w:val="VerbatimChar"/>
+        </w:rPr>
+        <w:t xml:space="preserve">APB_BLK</w:t>
+      </w:r>
+      <w:r>
+        <w:t xml:space="preserve"> </w:t>
+      </w:r>
+      <w:r>
+        <w:t xml:space="preserve">is written.</w:t>
       </w:r>
     </w:p>
     <w:p>
@@ -16068,7 +16179,7 @@
         <w:pStyle w:val="Compact"/>
         <w:numPr>
           <w:ilvl w:val="0"/>
-          <w:numId w:val="1015"/>
+          <w:numId w:val="1014"/>
         </w:numPr>
         <w:jc w:val="left"/>
       </w:pPr>
@@ -16076,22 +16187,52 @@
         <w:rPr>
           <w:rStyle w:val="VerbatimChar"/>
         </w:rPr>
-        <w:t xml:space="preserve">SCRC_CLK_003</w:t>
-      </w:r>
-      <w:r>
-        <w:t xml:space="preserve"> </w:t>
-      </w:r>
-      <w:r>
-        <w:t xml:space="preserve">After any chip reset every gateable clock runs except</w:t>
-      </w:r>
-      <w:r>
-        <w:t xml:space="preserve"> </w:t>
-      </w:r>
-      <w:r>
-        <w:rPr>
-          <w:rStyle w:val="VerbatimChar"/>
-        </w:rPr>
-        <w:t xml:space="preserve">timer_1</w:t>
+        <w:t xml:space="preserve">SCRC_RST_004</w:t>
+      </w:r>
+      <w:r>
+        <w:t xml:space="preserve"> </w:t>
+      </w:r>
+      <w:r>
+        <w:t xml:space="preserve">With</w:t>
+      </w:r>
+      <w:r>
+        <w:t xml:space="preserve"> </w:t>
+      </w:r>
+      <w:r>
+        <w:rPr>
+          <w:rStyle w:val="VerbatimChar"/>
+        </w:rPr>
+        <w:t xml:space="preserve">i_dbg_cpu_hold</w:t>
+      </w:r>
+      <w:r>
+        <w:t xml:space="preserve"> </w:t>
+      </w:r>
+      <w:r>
+        <w:t xml:space="preserve">= 1,</w:t>
+      </w:r>
+      <w:r>
+        <w:t xml:space="preserve"> </w:t>
+      </w:r>
+      <w:r>
+        <w:rPr>
+          <w:rStyle w:val="VerbatimChar"/>
+        </w:rPr>
+        <w:t xml:space="preserve">o_rst_n_cpu</w:t>
+      </w:r>
+      <w:r>
+        <w:t xml:space="preserve"> </w:t>
+      </w:r>
+      <w:r>
+        <w:t xml:space="preserve">stays 0 for any</w:t>
+      </w:r>
+      <w:r>
+        <w:t xml:space="preserve"> </w:t>
+      </w:r>
+      <w:r>
+        <w:rPr>
+          <w:rStyle w:val="VerbatimChar"/>
+        </w:rPr>
+        <w:t xml:space="preserve">RST_REL[31]</w:t>
       </w:r>
       <w:r>
         <w:t xml:space="preserve">.</w:t>
@@ -16102,7 +16243,7 @@
         <w:pStyle w:val="Compact"/>
         <w:numPr>
           <w:ilvl w:val="0"/>
-          <w:numId w:val="1015"/>
+          <w:numId w:val="1014"/>
         </w:numPr>
         <w:jc w:val="left"/>
       </w:pPr>
@@ -16110,82 +16251,52 @@
         <w:rPr>
           <w:rStyle w:val="VerbatimChar"/>
         </w:rPr>
-        <w:t xml:space="preserve">SCRC_RST_001</w:t>
-      </w:r>
-      <w:r>
-        <w:t xml:space="preserve"> </w:t>
-      </w:r>
-      <w:r>
-        <w:t xml:space="preserve">A WDT bite and</w:t>
-      </w:r>
-      <w:r>
-        <w:t xml:space="preserve"> </w:t>
-      </w:r>
-      <w:r>
-        <w:rPr>
-          <w:rStyle w:val="VerbatimChar"/>
-        </w:rPr>
-        <w:t xml:space="preserve">SW_RST</w:t>
-      </w:r>
-      <w:r>
-        <w:t xml:space="preserve"> </w:t>
-      </w:r>
-      <w:r>
-        <w:t xml:space="preserve">each hold</w:t>
-      </w:r>
-      <w:r>
-        <w:t xml:space="preserve"> </w:t>
-      </w:r>
-      <w:r>
-        <w:rPr>
-          <w:rStyle w:val="VerbatimChar"/>
-        </w:rPr>
-        <w:t xml:space="preserve">w_rst_n_sys</w:t>
-      </w:r>
-      <w:r>
-        <w:t xml:space="preserve"> </w:t>
-      </w:r>
-      <w:r>
-        <w:t xml:space="preserve">low for exactly</w:t>
-      </w:r>
-      <w:r>
-        <w:t xml:space="preserve"> </w:t>
-      </w:r>
-      <w:r>
-        <w:t xml:space="preserve">16 cycles; after POR it releases 16 cycles after</w:t>
-      </w:r>
-      <w:r>
-        <w:t xml:space="preserve"> </w:t>
-      </w:r>
-      <w:r>
-        <w:rPr>
-          <w:rStyle w:val="VerbatimChar"/>
-        </w:rPr>
-        <w:t xml:space="preserve">w_rst_n_por</w:t>
-      </w:r>
-      <w:r>
-        <w:t xml:space="preserve">. Each asserts</w:t>
-      </w:r>
-      <w:r>
-        <w:t xml:space="preserve"> </w:t>
-      </w:r>
-      <w:r>
-        <w:t xml:space="preserve">every domain reset except</w:t>
-      </w:r>
-      <w:r>
-        <w:t xml:space="preserve"> </w:t>
-      </w:r>
-      <w:r>
-        <w:rPr>
-          <w:rStyle w:val="VerbatimChar"/>
-        </w:rPr>
-        <w:t xml:space="preserve">sysdbg</w:t>
-      </w:r>
-      <w:r>
-        <w:t xml:space="preserve"> </w:t>
-      </w:r>
-      <w:r>
-        <w:t xml:space="preserve">(WDT, SW).</w:t>
+        <w:t xml:space="preserve">SCRC_RST_005</w:t>
+      </w:r>
+      <w:r>
+        <w:t xml:space="preserve"> </w:t>
+      </w:r>
+      <w:r>
+        <w:t xml:space="preserve">WDT and SW resets do not change</w:t>
+      </w:r>
+      <w:r>
+        <w:t xml:space="preserve"> </w:t>
+      </w:r>
+      <w:r>
+        <w:rPr>
+          <w:rStyle w:val="VerbatimChar"/>
+        </w:rPr>
+        <w:t xml:space="preserve">RRC</w:t>
+      </w:r>
+      <w:r>
+        <w:t xml:space="preserve">,</w:t>
+      </w:r>
+      <w:r>
+        <w:t xml:space="preserve"> </w:t>
+      </w:r>
+      <w:r>
+        <w:rPr>
+          <w:rStyle w:val="VerbatimChar"/>
+        </w:rPr>
+        <w:t xml:space="preserve">o_rst_n_por</w:t>
+      </w:r>
+      <w:r>
+        <w:t xml:space="preserve"> </w:t>
+      </w:r>
+      <w:r>
+        <w:t xml:space="preserve">or</w:t>
+      </w:r>
+      <w:r>
+        <w:t xml:space="preserve"> </w:t>
+      </w:r>
+      <w:r>
+        <w:rPr>
+          <w:rStyle w:val="VerbatimChar"/>
+        </w:rPr>
+        <w:t xml:space="preserve">o_rst_n_sysdbg</w:t>
+      </w:r>
+      <w:r>
+        <w:t xml:space="preserve">.</w:t>
       </w:r>
     </w:p>
     <w:p>
@@ -16193,7 +16304,7 @@
         <w:pStyle w:val="Compact"/>
         <w:numPr>
           <w:ilvl w:val="0"/>
-          <w:numId w:val="1015"/>
+          <w:numId w:val="1014"/>
         </w:numPr>
         <w:jc w:val="left"/>
       </w:pPr>
@@ -16201,13 +16312,76 @@
         <w:rPr>
           <w:rStyle w:val="VerbatimChar"/>
         </w:rPr>
-        <w:t xml:space="preserve">SCRC_RST_002</w:t>
-      </w:r>
-      <w:r>
-        <w:t xml:space="preserve"> </w:t>
-      </w:r>
-      <w:r>
-        <w:t xml:space="preserve">Each domain reset releases 2 domain-clock edges after its input rises.</w:t>
+        <w:t xml:space="preserve">SCRC_RST_007</w:t>
+      </w:r>
+      <w:r>
+        <w:t xml:space="preserve"> </w:t>
+      </w:r>
+      <w:r>
+        <w:t xml:space="preserve">Before the CPU reset releases,</w:t>
+      </w:r>
+      <w:r>
+        <w:t xml:space="preserve"> </w:t>
+      </w:r>
+      <w:r>
+        <w:rPr>
+          <w:rStyle w:val="VerbatimChar"/>
+        </w:rPr>
+        <w:t xml:space="preserve">APB_BLK</w:t>
+      </w:r>
+      <w:r>
+        <w:t xml:space="preserve"> </w:t>
+      </w:r>
+      <w:r>
+        <w:t xml:space="preserve">= NOT</w:t>
+      </w:r>
+      <w:r>
+        <w:t xml:space="preserve"> </w:t>
+      </w:r>
+      <w:r>
+        <w:rPr>
+          <w:rStyle w:val="VerbatimChar"/>
+        </w:rPr>
+        <w:t xml:space="preserve">CLK_EN</w:t>
+      </w:r>
+      <w:r>
+        <w:t xml:space="preserve"> </w:t>
+      </w:r>
+      <w:r>
+        <w:t xml:space="preserve">on the</w:t>
+      </w:r>
+      <w:r>
+        <w:t xml:space="preserve"> </w:t>
+      </w:r>
+      <w:r>
+        <w:t xml:space="preserve">gateable bits; the boot ROM’s first</w:t>
+      </w:r>
+      <w:r>
+        <w:t xml:space="preserve"> </w:t>
+      </w:r>
+      <w:r>
+        <w:rPr>
+          <w:rStyle w:val="VerbatimChar"/>
+        </w:rPr>
+        <w:t xml:space="preserve">UART0</w:t>
+      </w:r>
+      <w:r>
+        <w:t xml:space="preserve"> </w:t>
+      </w:r>
+      <w:r>
+        <w:t xml:space="preserve">access completes without</w:t>
+      </w:r>
+      <w:r>
+        <w:t xml:space="preserve"> </w:t>
+      </w:r>
+      <w:r>
+        <w:rPr>
+          <w:rStyle w:val="VerbatimChar"/>
+        </w:rPr>
+        <w:t xml:space="preserve">PSLVERR</w:t>
+      </w:r>
+      <w:r>
+        <w:t xml:space="preserve">.</w:t>
       </w:r>
     </w:p>
     <w:p>
@@ -16215,7 +16389,7 @@
         <w:pStyle w:val="Compact"/>
         <w:numPr>
           <w:ilvl w:val="0"/>
-          <w:numId w:val="1015"/>
+          <w:numId w:val="1014"/>
         </w:numPr>
         <w:jc w:val="left"/>
       </w:pPr>
@@ -16223,34 +16397,49 @@
         <w:rPr>
           <w:rStyle w:val="VerbatimChar"/>
         </w:rPr>
-        <w:t xml:space="preserve">SCRC_RST_003</w:t>
-      </w:r>
-      <w:r>
-        <w:t xml:space="preserve"> </w:t>
-      </w:r>
-      <w:r>
-        <w:t xml:space="preserve">All non-CPU domains release in the same cycle; the CPU releases</w:t>
-      </w:r>
-      <w:r>
-        <w:t xml:space="preserve"> </w:t>
-      </w:r>
-      <w:r>
-        <w:t xml:space="preserve">&gt;= 16 cycles later and after</w:t>
-      </w:r>
-      <w:r>
-        <w:t xml:space="preserve"> </w:t>
-      </w:r>
-      <w:r>
-        <w:rPr>
-          <w:rStyle w:val="VerbatimChar"/>
-        </w:rPr>
-        <w:t xml:space="preserve">APB_BLK</w:t>
-      </w:r>
-      <w:r>
-        <w:t xml:space="preserve"> </w:t>
-      </w:r>
-      <w:r>
-        <w:t xml:space="preserve">is written.</w:t>
+        <w:t xml:space="preserve">SCRC_RST_008</w:t>
+      </w:r>
+      <w:r>
+        <w:t xml:space="preserve"> </w:t>
+      </w:r>
+      <w:r>
+        <w:t xml:space="preserve">After a chip reset,</w:t>
+      </w:r>
+      <w:r>
+        <w:t xml:space="preserve"> </w:t>
+      </w:r>
+      <w:r>
+        <w:rPr>
+          <w:rStyle w:val="VerbatimChar"/>
+        </w:rPr>
+        <w:t xml:space="preserve">o_rst_n_timer_1</w:t>
+      </w:r>
+      <w:r>
+        <w:t xml:space="preserve"> </w:t>
+      </w:r>
+      <w:r>
+        <w:t xml:space="preserve">= 0 until</w:t>
+      </w:r>
+      <w:r>
+        <w:t xml:space="preserve"> </w:t>
+      </w:r>
+      <w:r>
+        <w:rPr>
+          <w:rStyle w:val="VerbatimChar"/>
+        </w:rPr>
+        <w:t xml:space="preserve">CLK_EN[4]</w:t>
+      </w:r>
+      <w:r>
+        <w:t xml:space="preserve"> </w:t>
+      </w:r>
+      <w:r>
+        <w:t xml:space="preserve">is set,</w:t>
+      </w:r>
+      <w:r>
+        <w:t xml:space="preserve"> </w:t>
+      </w:r>
+      <w:r>
+        <w:t xml:space="preserve">then releases.</w:t>
       </w:r>
     </w:p>
     <w:p>
@@ -16258,7 +16447,7 @@
         <w:pStyle w:val="Compact"/>
         <w:numPr>
           <w:ilvl w:val="0"/>
-          <w:numId w:val="1015"/>
+          <w:numId w:val="1014"/>
         </w:numPr>
         <w:jc w:val="left"/>
       </w:pPr>
@@ -16266,55 +16455,49 @@
         <w:rPr>
           <w:rStyle w:val="VerbatimChar"/>
         </w:rPr>
-        <w:t xml:space="preserve">SCRC_RST_004</w:t>
-      </w:r>
-      <w:r>
-        <w:t xml:space="preserve"> </w:t>
-      </w:r>
-      <w:r>
-        <w:t xml:space="preserve">With</w:t>
-      </w:r>
-      <w:r>
-        <w:t xml:space="preserve"> </w:t>
-      </w:r>
-      <w:r>
-        <w:rPr>
-          <w:rStyle w:val="VerbatimChar"/>
-        </w:rPr>
-        <w:t xml:space="preserve">i_dbg_cpu_hold</w:t>
-      </w:r>
-      <w:r>
-        <w:t xml:space="preserve"> </w:t>
-      </w:r>
-      <w:r>
-        <w:t xml:space="preserve">= 1,</w:t>
-      </w:r>
-      <w:r>
-        <w:t xml:space="preserve"> </w:t>
-      </w:r>
-      <w:r>
-        <w:rPr>
-          <w:rStyle w:val="VerbatimChar"/>
-        </w:rPr>
-        <w:t xml:space="preserve">o_rst_n_cpu</w:t>
-      </w:r>
-      <w:r>
-        <w:t xml:space="preserve"> </w:t>
-      </w:r>
-      <w:r>
-        <w:t xml:space="preserve">stays 0 for any</w:t>
-      </w:r>
-      <w:r>
-        <w:t xml:space="preserve"> </w:t>
-      </w:r>
-      <w:r>
-        <w:rPr>
-          <w:rStyle w:val="VerbatimChar"/>
-        </w:rPr>
-        <w:t xml:space="preserve">RST_REL[31]</w:t>
-      </w:r>
-      <w:r>
-        <w:t xml:space="preserve">.</w:t>
+        <w:t xml:space="preserve">SCRC_RRC_001</w:t>
+      </w:r>
+      <w:r>
+        <w:t xml:space="preserve"> </w:t>
+      </w:r>
+      <w:r>
+        <w:t xml:space="preserve">A WDT request cleared by the reset it causes still gives one</w:t>
+      </w:r>
+      <w:r>
+        <w:t xml:space="preserve"> </w:t>
+      </w:r>
+      <w:r>
+        <w:t xml:space="preserve">16-cycle reset, with</w:t>
+      </w:r>
+      <w:r>
+        <w:t xml:space="preserve"> </w:t>
+      </w:r>
+      <w:r>
+        <w:rPr>
+          <w:rStyle w:val="VerbatimChar"/>
+        </w:rPr>
+        <w:t xml:space="preserve">o_cause_we_wdt</w:t>
+      </w:r>
+      <w:r>
+        <w:t xml:space="preserve"> </w:t>
+      </w:r>
+      <w:r>
+        <w:t xml:space="preserve">= 1 for exactly those 16 cycles and</w:t>
+      </w:r>
+      <w:r>
+        <w:t xml:space="preserve"> </w:t>
+      </w:r>
+      <w:r>
+        <w:rPr>
+          <w:rStyle w:val="VerbatimChar"/>
+        </w:rPr>
+        <w:t xml:space="preserve">o_cause_we_sw</w:t>
+      </w:r>
+      <w:r>
+        <w:t xml:space="preserve"> </w:t>
+      </w:r>
+      <w:r>
+        <w:t xml:space="preserve">= 0.</w:t>
       </w:r>
     </w:p>
     <w:p>
@@ -16322,7 +16505,7 @@
         <w:pStyle w:val="Compact"/>
         <w:numPr>
           <w:ilvl w:val="0"/>
-          <w:numId w:val="1015"/>
+          <w:numId w:val="1014"/>
         </w:numPr>
         <w:jc w:val="left"/>
       </w:pPr>
@@ -16330,52 +16513,49 @@
         <w:rPr>
           <w:rStyle w:val="VerbatimChar"/>
         </w:rPr>
-        <w:t xml:space="preserve">SCRC_RST_005</w:t>
-      </w:r>
-      <w:r>
-        <w:t xml:space="preserve"> </w:t>
-      </w:r>
-      <w:r>
-        <w:t xml:space="preserve">WDT and SW resets do not change</w:t>
-      </w:r>
-      <w:r>
-        <w:t xml:space="preserve"> </w:t>
-      </w:r>
-      <w:r>
-        <w:rPr>
-          <w:rStyle w:val="VerbatimChar"/>
-        </w:rPr>
-        <w:t xml:space="preserve">RRC</w:t>
-      </w:r>
-      <w:r>
-        <w:t xml:space="preserve">,</w:t>
-      </w:r>
-      <w:r>
-        <w:t xml:space="preserve"> </w:t>
-      </w:r>
-      <w:r>
-        <w:rPr>
-          <w:rStyle w:val="VerbatimChar"/>
-        </w:rPr>
-        <w:t xml:space="preserve">o_rst_n_por</w:t>
-      </w:r>
-      <w:r>
-        <w:t xml:space="preserve"> </w:t>
-      </w:r>
-      <w:r>
-        <w:t xml:space="preserve">or</w:t>
-      </w:r>
-      <w:r>
-        <w:t xml:space="preserve"> </w:t>
-      </w:r>
-      <w:r>
-        <w:rPr>
-          <w:rStyle w:val="VerbatimChar"/>
-        </w:rPr>
-        <w:t xml:space="preserve">o_rst_n_sysdbg</w:t>
-      </w:r>
-      <w:r>
-        <w:t xml:space="preserve">.</w:t>
+        <w:t xml:space="preserve">SCRC_FLT_001</w:t>
+      </w:r>
+      <w:r>
+        <w:t xml:space="preserve"> </w:t>
+      </w:r>
+      <w:r>
+        <w:t xml:space="preserve">A pulse on</w:t>
+      </w:r>
+      <w:r>
+        <w:t xml:space="preserve"> </w:t>
+      </w:r>
+      <w:r>
+        <w:rPr>
+          <w:rStyle w:val="VerbatimChar"/>
+        </w:rPr>
+        <w:t xml:space="preserve">i_rst_n_pad</w:t>
+      </w:r>
+      <w:r>
+        <w:t xml:space="preserve"> </w:t>
+      </w:r>
+      <w:r>
+        <w:t xml:space="preserve">shorter than the three-cell delay does not</w:t>
+      </w:r>
+      <w:r>
+        <w:t xml:space="preserve"> </w:t>
+      </w:r>
+      <w:r>
+        <w:t xml:space="preserve">change</w:t>
+      </w:r>
+      <w:r>
+        <w:t xml:space="preserve"> </w:t>
+      </w:r>
+      <w:r>
+        <w:rPr>
+          <w:rStyle w:val="VerbatimChar"/>
+        </w:rPr>
+        <w:t xml:space="preserve">w_rst_n_por</w:t>
+      </w:r>
+      <w:r>
+        <w:t xml:space="preserve"> </w:t>
+      </w:r>
+      <w:r>
+        <w:t xml:space="preserve">(gate-level simulation with library delays).</w:t>
       </w:r>
     </w:p>
     <w:p>
@@ -16383,7 +16563,7 @@
         <w:pStyle w:val="Compact"/>
         <w:numPr>
           <w:ilvl w:val="0"/>
-          <w:numId w:val="1015"/>
+          <w:numId w:val="1014"/>
         </w:numPr>
         <w:jc w:val="left"/>
       </w:pPr>
@@ -16391,64 +16571,13 @@
         <w:rPr>
           <w:rStyle w:val="VerbatimChar"/>
         </w:rPr>
-        <w:t xml:space="preserve">SCRC_RST_007</w:t>
-      </w:r>
-      <w:r>
-        <w:t xml:space="preserve"> </w:t>
-      </w:r>
-      <w:r>
-        <w:t xml:space="preserve">Before the CPU reset releases,</w:t>
-      </w:r>
-      <w:r>
-        <w:t xml:space="preserve"> </w:t>
-      </w:r>
-      <w:r>
-        <w:rPr>
-          <w:rStyle w:val="VerbatimChar"/>
-        </w:rPr>
-        <w:t xml:space="preserve">APB_BLK</w:t>
-      </w:r>
-      <w:r>
-        <w:t xml:space="preserve"> </w:t>
-      </w:r>
-      <w:r>
-        <w:t xml:space="preserve">= NOT</w:t>
-      </w:r>
-      <w:r>
-        <w:t xml:space="preserve"> </w:t>
-      </w:r>
-      <w:r>
-        <w:rPr>
-          <w:rStyle w:val="VerbatimChar"/>
-        </w:rPr>
-        <w:t xml:space="preserve">CLK_EN</w:t>
-      </w:r>
-      <w:r>
-        <w:t xml:space="preserve"> </w:t>
-      </w:r>
-      <w:r>
-        <w:t xml:space="preserve">on the</w:t>
-      </w:r>
-      <w:r>
-        <w:t xml:space="preserve"> </w:t>
-      </w:r>
-      <w:r>
-        <w:t xml:space="preserve">gateable bits; the boot ROM’s first</w:t>
-      </w:r>
-      <w:r>
-        <w:t xml:space="preserve"> </w:t>
-      </w:r>
-      <w:r>
-        <w:rPr>
-          <w:rStyle w:val="VerbatimChar"/>
-        </w:rPr>
-        <w:t xml:space="preserve">UART0</w:t>
-      </w:r>
-      <w:r>
-        <w:t xml:space="preserve"> </w:t>
-      </w:r>
-      <w:r>
-        <w:t xml:space="preserve">access completes without</w:t>
+        <w:t xml:space="preserve">SCRC_CSR_001</w:t>
+      </w:r>
+      <w:r>
+        <w:t xml:space="preserve"> </w:t>
+      </w:r>
+      <w:r>
+        <w:t xml:space="preserve">Every row of the</w:t>
       </w:r>
       <w:r>
         <w:t xml:space="preserve"> </w:t>
@@ -16460,7 +16589,16 @@
         <w:t xml:space="preserve">PSLVERR</w:t>
       </w:r>
       <w:r>
-        <w:t xml:space="preserve">.</w:t>
+        <w:t xml:space="preserve"> </w:t>
+      </w:r>
+      <w:r>
+        <w:t xml:space="preserve">table (7.4) gives the stated result, and a</w:t>
+      </w:r>
+      <w:r>
+        <w:t xml:space="preserve"> </w:t>
+      </w:r>
+      <w:r>
+        <w:t xml:space="preserve">dropped write changes no register.</w:t>
       </w:r>
     </w:p>
     <w:p>
@@ -16468,7 +16606,7 @@
         <w:pStyle w:val="Compact"/>
         <w:numPr>
           <w:ilvl w:val="0"/>
-          <w:numId w:val="1015"/>
+          <w:numId w:val="1014"/>
         </w:numPr>
         <w:jc w:val="left"/>
       </w:pPr>
@@ -16476,49 +16614,19 @@
         <w:rPr>
           <w:rStyle w:val="VerbatimChar"/>
         </w:rPr>
-        <w:t xml:space="preserve">SCRC_RST_008</w:t>
-      </w:r>
-      <w:r>
-        <w:t xml:space="preserve"> </w:t>
-      </w:r>
-      <w:r>
-        <w:t xml:space="preserve">After a chip reset,</w:t>
-      </w:r>
-      <w:r>
-        <w:t xml:space="preserve"> </w:t>
-      </w:r>
-      <w:r>
-        <w:rPr>
-          <w:rStyle w:val="VerbatimChar"/>
-        </w:rPr>
-        <w:t xml:space="preserve">o_rst_n_timer_1</w:t>
-      </w:r>
-      <w:r>
-        <w:t xml:space="preserve"> </w:t>
-      </w:r>
-      <w:r>
-        <w:t xml:space="preserve">= 0 until</w:t>
-      </w:r>
-      <w:r>
-        <w:t xml:space="preserve"> </w:t>
-      </w:r>
-      <w:r>
-        <w:rPr>
-          <w:rStyle w:val="VerbatimChar"/>
-        </w:rPr>
-        <w:t xml:space="preserve">CLK_EN[4]</w:t>
-      </w:r>
-      <w:r>
-        <w:t xml:space="preserve"> </w:t>
-      </w:r>
-      <w:r>
-        <w:t xml:space="preserve">is set,</w:t>
-      </w:r>
-      <w:r>
-        <w:t xml:space="preserve"> </w:t>
-      </w:r>
-      <w:r>
-        <w:t xml:space="preserve">then releases.</w:t>
+        <w:t xml:space="preserve">SCRC_CSR_002</w:t>
+      </w:r>
+      <w:r>
+        <w:t xml:space="preserve"> </w:t>
+      </w:r>
+      <w:r>
+        <w:t xml:space="preserve">Reset value, implemented bits and access of every register match</w:t>
+      </w:r>
+      <w:r>
+        <w:t xml:space="preserve"> </w:t>
+      </w:r>
+      <w:r>
+        <w:t xml:space="preserve">section 6, per master.</w:t>
       </w:r>
     </w:p>
     <w:p>
@@ -16526,7 +16634,7 @@
         <w:pStyle w:val="Compact"/>
         <w:numPr>
           <w:ilvl w:val="0"/>
-          <w:numId w:val="1015"/>
+          <w:numId w:val="1014"/>
         </w:numPr>
         <w:jc w:val="left"/>
       </w:pPr>
@@ -16534,49 +16642,43 @@
         <w:rPr>
           <w:rStyle w:val="VerbatimChar"/>
         </w:rPr>
-        <w:t xml:space="preserve">SCRC_RRC_001</w:t>
-      </w:r>
-      <w:r>
-        <w:t xml:space="preserve"> </w:t>
-      </w:r>
-      <w:r>
-        <w:t xml:space="preserve">A WDT request cleared by the reset it causes still gives one</w:t>
-      </w:r>
-      <w:r>
-        <w:t xml:space="preserve"> </w:t>
-      </w:r>
-      <w:r>
-        <w:t xml:space="preserve">16-cycle reset, with</w:t>
-      </w:r>
-      <w:r>
-        <w:t xml:space="preserve"> </w:t>
-      </w:r>
-      <w:r>
-        <w:rPr>
-          <w:rStyle w:val="VerbatimChar"/>
-        </w:rPr>
-        <w:t xml:space="preserve">o_cause_we_wdt</w:t>
-      </w:r>
-      <w:r>
-        <w:t xml:space="preserve"> </w:t>
-      </w:r>
-      <w:r>
-        <w:t xml:space="preserve">= 1 for exactly those 16 cycles and</w:t>
-      </w:r>
-      <w:r>
-        <w:t xml:space="preserve"> </w:t>
-      </w:r>
-      <w:r>
-        <w:rPr>
-          <w:rStyle w:val="VerbatimChar"/>
-        </w:rPr>
-        <w:t xml:space="preserve">o_cause_we_sw</w:t>
-      </w:r>
-      <w:r>
-        <w:t xml:space="preserve"> </w:t>
-      </w:r>
-      <w:r>
-        <w:t xml:space="preserve">= 0.</w:t>
+        <w:t xml:space="preserve">SCRC_SEQ_001</w:t>
+      </w:r>
+      <w:r>
+        <w:t xml:space="preserve"> </w:t>
+      </w:r>
+      <w:r>
+        <w:t xml:space="preserve">Any sequence of</w:t>
+      </w:r>
+      <w:r>
+        <w:t xml:space="preserve"> </w:t>
+      </w:r>
+      <w:r>
+        <w:rPr>
+          <w:rStyle w:val="VerbatimChar"/>
+        </w:rPr>
+        <w:t xml:space="preserve">CLK_EN</w:t>
+      </w:r>
+      <w:r>
+        <w:t xml:space="preserve"> </w:t>
+      </w:r>
+      <w:r>
+        <w:t xml:space="preserve">writes, back to back included, ends with</w:t>
+      </w:r>
+      <w:r>
+        <w:t xml:space="preserve"> </w:t>
+      </w:r>
+      <w:r>
+        <w:rPr>
+          <w:rStyle w:val="VerbatimChar"/>
+        </w:rPr>
+        <w:t xml:space="preserve">ICG_EN</w:t>
+      </w:r>
+      <w:r>
+        <w:t xml:space="preserve"> </w:t>
+      </w:r>
+      <w:r>
+        <w:t xml:space="preserve">= the last value written.</w:t>
       </w:r>
     </w:p>
     <w:p>
@@ -16584,7 +16686,7 @@
         <w:pStyle w:val="Compact"/>
         <w:numPr>
           <w:ilvl w:val="0"/>
-          <w:numId w:val="1015"/>
+          <w:numId w:val="1014"/>
         </w:numPr>
         <w:jc w:val="left"/>
       </w:pPr>
@@ -16592,49 +16694,13 @@
         <w:rPr>
           <w:rStyle w:val="VerbatimChar"/>
         </w:rPr>
-        <w:t xml:space="preserve">SCRC_FLT_001</w:t>
-      </w:r>
-      <w:r>
-        <w:t xml:space="preserve"> </w:t>
-      </w:r>
-      <w:r>
-        <w:t xml:space="preserve">A pulse on</w:t>
-      </w:r>
-      <w:r>
-        <w:t xml:space="preserve"> </w:t>
-      </w:r>
-      <w:r>
-        <w:rPr>
-          <w:rStyle w:val="VerbatimChar"/>
-        </w:rPr>
-        <w:t xml:space="preserve">i_rst_n_pad</w:t>
-      </w:r>
-      <w:r>
-        <w:t xml:space="preserve"> </w:t>
-      </w:r>
-      <w:r>
-        <w:t xml:space="preserve">shorter than the three-cell delay does not</w:t>
-      </w:r>
-      <w:r>
-        <w:t xml:space="preserve"> </w:t>
-      </w:r>
-      <w:r>
-        <w:t xml:space="preserve">change</w:t>
-      </w:r>
-      <w:r>
-        <w:t xml:space="preserve"> </w:t>
-      </w:r>
-      <w:r>
-        <w:rPr>
-          <w:rStyle w:val="VerbatimChar"/>
-        </w:rPr>
-        <w:t xml:space="preserve">w_rst_n_por</w:t>
-      </w:r>
-      <w:r>
-        <w:t xml:space="preserve"> </w:t>
-      </w:r>
-      <w:r>
-        <w:t xml:space="preserve">(gate-level simulation with library delays).</w:t>
+        <w:t xml:space="preserve">SCRC_SEQ_002</w:t>
+      </w:r>
+      <w:r>
+        <w:t xml:space="preserve"> </w:t>
+      </w:r>
+      <w:r>
+        <w:t xml:space="preserve">The invariant of 7.6 holds in every cycle (assertion).</w:t>
       </w:r>
     </w:p>
     <w:p>
@@ -16642,7 +16708,7 @@
         <w:pStyle w:val="Compact"/>
         <w:numPr>
           <w:ilvl w:val="0"/>
-          <w:numId w:val="1015"/>
+          <w:numId w:val="1014"/>
         </w:numPr>
         <w:jc w:val="left"/>
       </w:pPr>
@@ -16650,13 +16716,13 @@
         <w:rPr>
           <w:rStyle w:val="VerbatimChar"/>
         </w:rPr>
-        <w:t xml:space="preserve">SCRC_CSR_001</w:t>
-      </w:r>
-      <w:r>
-        <w:t xml:space="preserve"> </w:t>
-      </w:r>
-      <w:r>
-        <w:t xml:space="preserve">Every row of the</w:t>
+        <w:t xml:space="preserve">SCRC_BUS_001</w:t>
+      </w:r>
+      <w:r>
+        <w:t xml:space="preserve"> </w:t>
+      </w:r>
+      <w:r>
+        <w:t xml:space="preserve">An access to a blocked peripheral ends in one transfer with</w:t>
       </w:r>
       <w:r>
         <w:t xml:space="preserve"> </w:t>
@@ -16671,13 +16737,22 @@
         <w:t xml:space="preserve"> </w:t>
       </w:r>
       <w:r>
-        <w:t xml:space="preserve">table (7.4) gives the stated result, and a</w:t>
-      </w:r>
-      <w:r>
-        <w:t xml:space="preserve"> </w:t>
-      </w:r>
-      <w:r>
-        <w:t xml:space="preserve">dropped write changes no register.</w:t>
+        <w:t xml:space="preserve">= 1 and never asserts</w:t>
+      </w:r>
+      <w:r>
+        <w:t xml:space="preserve"> </w:t>
+      </w:r>
+      <w:r>
+        <w:rPr>
+          <w:rStyle w:val="VerbatimChar"/>
+        </w:rPr>
+        <w:t xml:space="preserve">PSEL</w:t>
+      </w:r>
+      <w:r>
+        <w:t xml:space="preserve"> </w:t>
+      </w:r>
+      <w:r>
+        <w:t xml:space="preserve">at the IP.</w:t>
       </w:r>
     </w:p>
     <w:p>
@@ -16685,7 +16760,7 @@
         <w:pStyle w:val="Compact"/>
         <w:numPr>
           <w:ilvl w:val="0"/>
-          <w:numId w:val="1015"/>
+          <w:numId w:val="1014"/>
         </w:numPr>
         <w:jc w:val="left"/>
       </w:pPr>
@@ -16693,19 +16768,28 @@
         <w:rPr>
           <w:rStyle w:val="VerbatimChar"/>
         </w:rPr>
-        <w:t xml:space="preserve">SCRC_CSR_002</w:t>
-      </w:r>
-      <w:r>
-        <w:t xml:space="preserve"> </w:t>
-      </w:r>
-      <w:r>
-        <w:t xml:space="preserve">Reset value, implemented bits and access of every register match</w:t>
-      </w:r>
-      <w:r>
-        <w:t xml:space="preserve"> </w:t>
-      </w:r>
-      <w:r>
-        <w:t xml:space="preserve">section 6, per master.</w:t>
+        <w:t xml:space="preserve">SCRC_BUS_002</w:t>
+      </w:r>
+      <w:r>
+        <w:t xml:space="preserve"> </w:t>
+      </w:r>
+      <w:r>
+        <w:t xml:space="preserve">A change of</w:t>
+      </w:r>
+      <w:r>
+        <w:t xml:space="preserve"> </w:t>
+      </w:r>
+      <w:r>
+        <w:rPr>
+          <w:rStyle w:val="VerbatimChar"/>
+        </w:rPr>
+        <w:t xml:space="preserve">APB_BLK</w:t>
+      </w:r>
+      <w:r>
+        <w:t xml:space="preserve"> </w:t>
+      </w:r>
+      <w:r>
+        <w:t xml:space="preserve">during a transfer does not change its response.</w:t>
       </w:r>
     </w:p>
     <w:p>
@@ -16713,7 +16797,7 @@
         <w:pStyle w:val="Compact"/>
         <w:numPr>
           <w:ilvl w:val="0"/>
-          <w:numId w:val="1015"/>
+          <w:numId w:val="1014"/>
         </w:numPr>
         <w:jc w:val="left"/>
       </w:pPr>
@@ -16721,43 +16805,63 @@
         <w:rPr>
           <w:rStyle w:val="VerbatimChar"/>
         </w:rPr>
-        <w:t xml:space="preserve">SCRC_SEQ_001</w:t>
-      </w:r>
-      <w:r>
-        <w:t xml:space="preserve"> </w:t>
-      </w:r>
-      <w:r>
-        <w:t xml:space="preserve">Any sequence of</w:t>
-      </w:r>
-      <w:r>
-        <w:t xml:space="preserve"> </w:t>
-      </w:r>
-      <w:r>
-        <w:rPr>
-          <w:rStyle w:val="VerbatimChar"/>
-        </w:rPr>
-        <w:t xml:space="preserve">CLK_EN</w:t>
-      </w:r>
-      <w:r>
-        <w:t xml:space="preserve"> </w:t>
-      </w:r>
-      <w:r>
-        <w:t xml:space="preserve">writes, back to back included, ends with</w:t>
-      </w:r>
-      <w:r>
-        <w:t xml:space="preserve"> </w:t>
-      </w:r>
-      <w:r>
-        <w:rPr>
-          <w:rStyle w:val="VerbatimChar"/>
-        </w:rPr>
-        <w:t xml:space="preserve">ICG_EN</w:t>
-      </w:r>
-      <w:r>
-        <w:t xml:space="preserve"> </w:t>
-      </w:r>
-      <w:r>
-        <w:t xml:space="preserve">= the last value written.</w:t>
+        <w:t xml:space="preserve">SCRC_BUS_003</w:t>
+      </w:r>
+      <w:r>
+        <w:t xml:space="preserve"> </w:t>
+      </w:r>
+      <w:r>
+        <w:t xml:space="preserve">With an IP holding</w:t>
+      </w:r>
+      <w:r>
+        <w:t xml:space="preserve"> </w:t>
+      </w:r>
+      <w:r>
+        <w:rPr>
+          <w:rStyle w:val="VerbatimChar"/>
+        </w:rPr>
+        <w:t xml:space="preserve">PREADY</w:t>
+      </w:r>
+      <w:r>
+        <w:t xml:space="preserve"> </w:t>
+      </w:r>
+      <w:r>
+        <w:t xml:space="preserve">low for</w:t>
+      </w:r>
+      <w:r>
+        <w:t xml:space="preserve"> </w:t>
+      </w:r>
+      <w:r>
+        <w:rPr>
+          <w:i/>
+          <w:iCs/>
+        </w:rPr>
+        <w:t xml:space="preserve">N</w:t>
+      </w:r>
+      <w:r>
+        <w:t xml:space="preserve"> </w:t>
+      </w:r>
+      <w:r>
+        <w:t xml:space="preserve">cycles, its clock stops only</w:t>
+      </w:r>
+      <w:r>
+        <w:t xml:space="preserve"> </w:t>
+      </w:r>
+      <w:r>
+        <w:t xml:space="preserve">after the transfer completes, for any</w:t>
+      </w:r>
+      <w:r>
+        <w:t xml:space="preserve"> </w:t>
+      </w:r>
+      <w:r>
+        <w:rPr>
+          <w:i/>
+          <w:iCs/>
+        </w:rPr>
+        <w:t xml:space="preserve">N</w:t>
+      </w:r>
+      <w:r>
+        <w:t xml:space="preserve">.</w:t>
       </w:r>
     </w:p>
     <w:p>
@@ -16765,7 +16869,7 @@
         <w:pStyle w:val="Compact"/>
         <w:numPr>
           <w:ilvl w:val="0"/>
-          <w:numId w:val="1015"/>
+          <w:numId w:val="1014"/>
         </w:numPr>
         <w:jc w:val="left"/>
       </w:pPr>
@@ -16773,13 +16877,70 @@
         <w:rPr>
           <w:rStyle w:val="VerbatimChar"/>
         </w:rPr>
-        <w:t xml:space="preserve">SCRC_SEQ_002</w:t>
-      </w:r>
-      <w:r>
-        <w:t xml:space="preserve"> </w:t>
-      </w:r>
-      <w:r>
-        <w:t xml:space="preserve">The invariant of 7.6 holds in every cycle (assertion).</w:t>
+        <w:t xml:space="preserve">SCRC_DBG_001</w:t>
+      </w:r>
+      <w:r>
+        <w:t xml:space="preserve"> </w:t>
+      </w:r>
+      <w:r>
+        <w:t xml:space="preserve">With</w:t>
+      </w:r>
+      <w:r>
+        <w:t xml:space="preserve"> </w:t>
+      </w:r>
+      <w:r>
+        <w:rPr>
+          <w:rStyle w:val="VerbatimChar"/>
+        </w:rPr>
+        <w:t xml:space="preserve">DBG_EN</w:t>
+      </w:r>
+      <w:r>
+        <w:t xml:space="preserve"> </w:t>
+      </w:r>
+      <w:r>
+        <w:t xml:space="preserve">= 0 the CPU releases as without</w:t>
+      </w:r>
+      <w:r>
+        <w:t xml:space="preserve"> </w:t>
+      </w:r>
+      <w:r>
+        <w:rPr>
+          <w:rStyle w:val="VerbatimChar"/>
+        </w:rPr>
+        <w:t xml:space="preserve">SYSDBG</w:t>
+      </w:r>
+      <w:r>
+        <w:t xml:space="preserve">; with</w:t>
+      </w:r>
+      <w:r>
+        <w:t xml:space="preserve"> </w:t>
+      </w:r>
+      <w:r>
+        <w:rPr>
+          <w:rStyle w:val="VerbatimChar"/>
+        </w:rPr>
+        <w:t xml:space="preserve">DBG_EN</w:t>
+      </w:r>
+      <w:r>
+        <w:t xml:space="preserve"> </w:t>
+      </w:r>
+      <w:r>
+        <w:t xml:space="preserve">= 1 it stays in reset until</w:t>
+      </w:r>
+      <w:r>
+        <w:t xml:space="preserve"> </w:t>
+      </w:r>
+      <w:r>
+        <w:rPr>
+          <w:rStyle w:val="VerbatimChar"/>
+        </w:rPr>
+        <w:t xml:space="preserve">CPUHOLD</w:t>
+      </w:r>
+      <w:r>
+        <w:t xml:space="preserve"> </w:t>
+      </w:r>
+      <w:r>
+        <w:t xml:space="preserve">= 0.</w:t>
       </w:r>
     </w:p>
     <w:p>
@@ -16787,247 +16948,7 @@
         <w:pStyle w:val="Compact"/>
         <w:numPr>
           <w:ilvl w:val="0"/>
-          <w:numId w:val="1015"/>
-        </w:numPr>
-        <w:jc w:val="left"/>
-      </w:pPr>
-      <w:r>
-        <w:rPr>
-          <w:rStyle w:val="VerbatimChar"/>
-        </w:rPr>
-        <w:t xml:space="preserve">SCRC_BUS_001</w:t>
-      </w:r>
-      <w:r>
-        <w:t xml:space="preserve"> </w:t>
-      </w:r>
-      <w:r>
-        <w:t xml:space="preserve">An access to a blocked peripheral ends in one transfer with</w:t>
-      </w:r>
-      <w:r>
-        <w:t xml:space="preserve"> </w:t>
-      </w:r>
-      <w:r>
-        <w:rPr>
-          <w:rStyle w:val="VerbatimChar"/>
-        </w:rPr>
-        <w:t xml:space="preserve">PSLVERR</w:t>
-      </w:r>
-      <w:r>
-        <w:t xml:space="preserve"> </w:t>
-      </w:r>
-      <w:r>
-        <w:t xml:space="preserve">= 1 and never asserts</w:t>
-      </w:r>
-      <w:r>
-        <w:t xml:space="preserve"> </w:t>
-      </w:r>
-      <w:r>
-        <w:rPr>
-          <w:rStyle w:val="VerbatimChar"/>
-        </w:rPr>
-        <w:t xml:space="preserve">PSEL</w:t>
-      </w:r>
-      <w:r>
-        <w:t xml:space="preserve"> </w:t>
-      </w:r>
-      <w:r>
-        <w:t xml:space="preserve">at the IP.</w:t>
-      </w:r>
-    </w:p>
-    <w:p>
-      <w:pPr>
-        <w:pStyle w:val="Compact"/>
-        <w:numPr>
-          <w:ilvl w:val="0"/>
-          <w:numId w:val="1015"/>
-        </w:numPr>
-        <w:jc w:val="left"/>
-      </w:pPr>
-      <w:r>
-        <w:rPr>
-          <w:rStyle w:val="VerbatimChar"/>
-        </w:rPr>
-        <w:t xml:space="preserve">SCRC_BUS_002</w:t>
-      </w:r>
-      <w:r>
-        <w:t xml:space="preserve"> </w:t>
-      </w:r>
-      <w:r>
-        <w:t xml:space="preserve">A change of</w:t>
-      </w:r>
-      <w:r>
-        <w:t xml:space="preserve"> </w:t>
-      </w:r>
-      <w:r>
-        <w:rPr>
-          <w:rStyle w:val="VerbatimChar"/>
-        </w:rPr>
-        <w:t xml:space="preserve">APB_BLK</w:t>
-      </w:r>
-      <w:r>
-        <w:t xml:space="preserve"> </w:t>
-      </w:r>
-      <w:r>
-        <w:t xml:space="preserve">during a transfer does not change its response.</w:t>
-      </w:r>
-    </w:p>
-    <w:p>
-      <w:pPr>
-        <w:pStyle w:val="Compact"/>
-        <w:numPr>
-          <w:ilvl w:val="0"/>
-          <w:numId w:val="1015"/>
-        </w:numPr>
-        <w:jc w:val="left"/>
-      </w:pPr>
-      <w:r>
-        <w:rPr>
-          <w:rStyle w:val="VerbatimChar"/>
-        </w:rPr>
-        <w:t xml:space="preserve">SCRC_BUS_003</w:t>
-      </w:r>
-      <w:r>
-        <w:t xml:space="preserve"> </w:t>
-      </w:r>
-      <w:r>
-        <w:t xml:space="preserve">With an IP holding</w:t>
-      </w:r>
-      <w:r>
-        <w:t xml:space="preserve"> </w:t>
-      </w:r>
-      <w:r>
-        <w:rPr>
-          <w:rStyle w:val="VerbatimChar"/>
-        </w:rPr>
-        <w:t xml:space="preserve">PREADY</w:t>
-      </w:r>
-      <w:r>
-        <w:t xml:space="preserve"> </w:t>
-      </w:r>
-      <w:r>
-        <w:t xml:space="preserve">low for</w:t>
-      </w:r>
-      <w:r>
-        <w:t xml:space="preserve"> </w:t>
-      </w:r>
-      <w:r>
-        <w:rPr>
-          <w:i/>
-          <w:iCs/>
-        </w:rPr>
-        <w:t xml:space="preserve">N</w:t>
-      </w:r>
-      <w:r>
-        <w:t xml:space="preserve"> </w:t>
-      </w:r>
-      <w:r>
-        <w:t xml:space="preserve">cycles, its clock stops only</w:t>
-      </w:r>
-      <w:r>
-        <w:t xml:space="preserve"> </w:t>
-      </w:r>
-      <w:r>
-        <w:t xml:space="preserve">after the transfer completes, for any</w:t>
-      </w:r>
-      <w:r>
-        <w:t xml:space="preserve"> </w:t>
-      </w:r>
-      <w:r>
-        <w:rPr>
-          <w:i/>
-          <w:iCs/>
-        </w:rPr>
-        <w:t xml:space="preserve">N</w:t>
-      </w:r>
-      <w:r>
-        <w:t xml:space="preserve">.</w:t>
-      </w:r>
-    </w:p>
-    <w:p>
-      <w:pPr>
-        <w:pStyle w:val="Compact"/>
-        <w:numPr>
-          <w:ilvl w:val="0"/>
-          <w:numId w:val="1015"/>
-        </w:numPr>
-        <w:jc w:val="left"/>
-      </w:pPr>
-      <w:r>
-        <w:rPr>
-          <w:rStyle w:val="VerbatimChar"/>
-        </w:rPr>
-        <w:t xml:space="preserve">SCRC_DBG_001</w:t>
-      </w:r>
-      <w:r>
-        <w:t xml:space="preserve"> </w:t>
-      </w:r>
-      <w:r>
-        <w:t xml:space="preserve">With</w:t>
-      </w:r>
-      <w:r>
-        <w:t xml:space="preserve"> </w:t>
-      </w:r>
-      <w:r>
-        <w:rPr>
-          <w:rStyle w:val="VerbatimChar"/>
-        </w:rPr>
-        <w:t xml:space="preserve">DBG_EN</w:t>
-      </w:r>
-      <w:r>
-        <w:t xml:space="preserve"> </w:t>
-      </w:r>
-      <w:r>
-        <w:t xml:space="preserve">= 0 the CPU releases as without</w:t>
-      </w:r>
-      <w:r>
-        <w:t xml:space="preserve"> </w:t>
-      </w:r>
-      <w:r>
-        <w:rPr>
-          <w:rStyle w:val="VerbatimChar"/>
-        </w:rPr>
-        <w:t xml:space="preserve">SYSDBG</w:t>
-      </w:r>
-      <w:r>
-        <w:t xml:space="preserve">; with</w:t>
-      </w:r>
-      <w:r>
-        <w:t xml:space="preserve"> </w:t>
-      </w:r>
-      <w:r>
-        <w:rPr>
-          <w:rStyle w:val="VerbatimChar"/>
-        </w:rPr>
-        <w:t xml:space="preserve">DBG_EN</w:t>
-      </w:r>
-      <w:r>
-        <w:t xml:space="preserve"> </w:t>
-      </w:r>
-      <w:r>
-        <w:t xml:space="preserve">= 1 it stays in reset until</w:t>
-      </w:r>
-      <w:r>
-        <w:t xml:space="preserve"> </w:t>
-      </w:r>
-      <w:r>
-        <w:rPr>
-          <w:rStyle w:val="VerbatimChar"/>
-        </w:rPr>
-        <w:t xml:space="preserve">CPUHOLD</w:t>
-      </w:r>
-      <w:r>
-        <w:t xml:space="preserve"> </w:t>
-      </w:r>
-      <w:r>
-        <w:t xml:space="preserve">= 0.</w:t>
-      </w:r>
-    </w:p>
-    <w:p>
-      <w:pPr>
-        <w:pStyle w:val="Compact"/>
-        <w:numPr>
-          <w:ilvl w:val="0"/>
-          <w:numId w:val="1015"/>
+          <w:numId w:val="1014"/>
         </w:numPr>
         <w:jc w:val="left"/>
       </w:pPr>
@@ -18106,56 +18027,78 @@
               <w:jc w:val="left"/>
             </w:pPr>
             <w:r>
-              <w:t xml:space="preserve">POR stretch:</w:t>
-            </w:r>
-            <w:r>
-              <w:t xml:space="preserve"> </w:t>
-            </w:r>
-            <w:r>
-              <w:rPr>
-                <w:rStyle w:val="VerbatimChar"/>
-              </w:rPr>
-              <w:t xml:space="preserve">CNT</w:t>
-            </w:r>
-            <w:r>
-              <w:t xml:space="preserve"> </w:t>
-            </w:r>
-            <w:r>
-              <w:t xml:space="preserve">and flip-flop reset values</w:t>
-            </w:r>
-          </w:p>
-        </w:tc>
-        <w:tc>
-          <w:tcPr/>
-          <w:p>
-            <w:pPr>
-              <w:pStyle w:val="Compact"/>
-              <w:jc w:val="left"/>
-            </w:pPr>
-            <w:r>
-              <w:t xml:space="preserve">lead, V3.0</w:t>
-            </w:r>
-          </w:p>
-        </w:tc>
-        <w:tc>
-          <w:tcPr/>
-          <w:p>
-            <w:pPr>
-              <w:pStyle w:val="Compact"/>
-              <w:jc w:val="left"/>
-            </w:pPr>
-            <w:r>
-              <w:t xml:space="preserve">7.3;</w:t>
-            </w:r>
-            <w:r>
-              <w:t xml:space="preserve"> </w:t>
-            </w:r>
-            <w:r>
-              <w:rPr>
-                <w:b/>
-                <w:bCs/>
-              </w:rPr>
-              <w:t xml:space="preserve">owner to confirm</w:t>
+              <w:t xml:space="preserve">No stretch after POR</w:t>
+            </w:r>
+          </w:p>
+        </w:tc>
+        <w:tc>
+          <w:tcPr/>
+          <w:p>
+            <w:pPr>
+              <w:pStyle w:val="Compact"/>
+              <w:jc w:val="left"/>
+            </w:pPr>
+            <w:r>
+              <w:t xml:space="preserve">lead proposal, adopted by the owner</w:t>
+            </w:r>
+          </w:p>
+        </w:tc>
+        <w:tc>
+          <w:tcPr/>
+          <w:p>
+            <w:pPr>
+              <w:pStyle w:val="Compact"/>
+              <w:jc w:val="left"/>
+            </w:pPr>
+            <w:r>
+              <w:t xml:space="preserve">7.3,</w:t>
+            </w:r>
+            <w:r>
+              <w:t xml:space="preserve"> </w:t>
+            </w:r>
+            <w:r>
+              <w:rPr>
+                <w:rStyle w:val="VerbatimChar"/>
+              </w:rPr>
+              <w:t xml:space="preserve">SCRC_RST_001</w:t>
+            </w:r>
+          </w:p>
+        </w:tc>
+      </w:tr>
+      <w:tr>
+        <w:tc>
+          <w:tcPr/>
+          <w:p>
+            <w:pPr>
+              <w:pStyle w:val="Compact"/>
+              <w:jc w:val="left"/>
+            </w:pPr>
+            <w:r>
+              <w:t xml:space="preserve">Two CSRs instead of APB BUS + WFs</w:t>
+            </w:r>
+          </w:p>
+        </w:tc>
+        <w:tc>
+          <w:tcPr/>
+          <w:p>
+            <w:pPr>
+              <w:pStyle w:val="Compact"/>
+              <w:jc w:val="left"/>
+            </w:pPr>
+            <w:r>
+              <w:t xml:space="preserve">lead proposal</w:t>
+            </w:r>
+          </w:p>
+        </w:tc>
+        <w:tc>
+          <w:tcPr/>
+          <w:p>
+            <w:pPr>
+              <w:pStyle w:val="Compact"/>
+              <w:jc w:val="left"/>
+            </w:pPr>
+            <w:r>
+              <w:t xml:space="preserve">Rejected by the owner: the mentor’s design stays, DECISIONS 4</w:t>
             </w:r>
           </w:p>
         </w:tc>
@@ -18628,7 +18571,7 @@
       <w:rPr>
         <w:szCs w:val="26"/>
       </w:rPr>
-      <w:t>V3.0</w:t>
+      <w:t>V3.1</w:t>
     </w:r>
     <w:r>
       <w:rPr>
@@ -20571,9 +20514,6 @@
     <w:abstractNumId w:val="991"/>
   </w:num>
   <w:num w:numId="1014">
-    <w:abstractNumId w:val="991"/>
-  </w:num>
-  <w:num w:numId="1015">
     <w:abstractNumId w:val="99411"/>
     <w:lvlOverride w:ilvl="0">
       <w:startOverride w:val="1"/>

</xml_diff>

<commit_message>
docs(scrc): v3.1, the owner's decisions on the two proposals (#46)
No stretch after POR, adopted: every RRC flip-flop, CNT included, resets
to 0 and w_rst_n_sys releases one cycle after w_rst_n_por; every domain is
still held by RST_REL = 0 until the power-up program. The 16-cycle stretch
stays for WDT and SW. SCRC_RST_001 updated.

Two CSRs instead of APB BUS + WFs, rejected: the mentor's design stays.
The APB BUS name-clash item keeps only the rename of the generated module.
</commit_message>
<xml_diff>
--- a/doc/specs/docx/QNSC_SCRC_MAS.docx
+++ b/doc/specs/docx/QNSC_SCRC_MAS.docx
@@ -15,7 +15,7 @@
         <w:pStyle w:val="Subtitle"/>
       </w:pPr>
       <w:r>
-        <w:t xml:space="preserve">MICRO-ARCHITECTURE SPECIFICATION – V3.0</w:t>
+        <w:t xml:space="preserve">MICRO-ARCHITECTURE SPECIFICATION – V3.1</w:t>
       </w:r>
     </w:p>
     <w:p>
@@ -603,6 +603,80 @@
           </w:p>
         </w:tc>
       </w:tr>
+      <w:tr>
+        <w:tc>
+          <w:tcPr/>
+          <w:p>
+            <w:pPr>
+              <w:pStyle w:val="Compact"/>
+              <w:jc w:val="left"/>
+            </w:pPr>
+            <w:r>
+              <w:t xml:space="preserve">V3.1</w:t>
+            </w:r>
+          </w:p>
+        </w:tc>
+        <w:tc>
+          <w:tcPr/>
+          <w:p>
+            <w:pPr>
+              <w:pStyle w:val="Compact"/>
+              <w:jc w:val="left"/>
+            </w:pPr>
+            <w:r>
+              <w:t xml:space="preserve">2026-09-28</w:t>
+            </w:r>
+          </w:p>
+        </w:tc>
+        <w:tc>
+          <w:tcPr/>
+          <w:p>
+            <w:pPr>
+              <w:pStyle w:val="Compact"/>
+              <w:jc w:val="left"/>
+            </w:pPr>
+            <w:r>
+              <w:t xml:space="preserve">Nghia VT (lead), for Nguyen Hao Nam</w:t>
+            </w:r>
+          </w:p>
+        </w:tc>
+        <w:tc>
+          <w:tcPr/>
+          <w:p>
+            <w:pPr>
+              <w:pStyle w:val="Compact"/>
+              <w:jc w:val="left"/>
+            </w:pPr>
+            <w:r>
+              <w:t xml:space="preserve">–</w:t>
+            </w:r>
+          </w:p>
+        </w:tc>
+        <w:tc>
+          <w:tcPr/>
+          <w:p>
+            <w:pPr>
+              <w:pStyle w:val="Compact"/>
+              <w:jc w:val="left"/>
+            </w:pPr>
+            <w:r>
+              <w:t xml:space="preserve">Owner decisions on the two proposals: no stretch after POR, adopted (7.3,</w:t>
+            </w:r>
+            <w:r>
+              <w:t xml:space="preserve"> </w:t>
+            </w:r>
+            <w:r>
+              <w:rPr>
+                <w:rStyle w:val="VerbatimChar"/>
+              </w:rPr>
+              <w:t xml:space="preserve">SCRC_RST_001</w:t>
+            </w:r>
+            <w:r>
+              <w:t xml:space="preserve">); two CSRs, rejected, the mentor’s APB BUS and WFs stay. Open item on the APB BUS name narrowed to renaming the generated module</w:t>
+            </w:r>
+          </w:p>
+        </w:tc>
+      </w:tr>
     </w:tbl>
     <w:bookmarkEnd w:id="26"/>
     <w:bookmarkStart w:id="27" w:name="overview"/>
@@ -928,7 +1002,19 @@
         <w:t xml:space="preserve"> </w:t>
       </w:r>
       <w:r>
-        <w:t xml:space="preserve">16-cycle chip reset, with the cause reported to</w:t>
+        <w:t xml:space="preserve">chip reset, 16 cycles after a WDT bite or</w:t>
+      </w:r>
+      <w:r>
+        <w:t xml:space="preserve"> </w:t>
+      </w:r>
+      <w:r>
+        <w:rPr>
+          <w:rStyle w:val="VerbatimChar"/>
+        </w:rPr>
+        <w:t xml:space="preserve">SW_RST</w:t>
+      </w:r>
+      <w:r>
+        <w:t xml:space="preserve">, with the cause reported to</w:t>
       </w:r>
       <w:r>
         <w:t xml:space="preserve"> </w:t>
@@ -8663,7 +8749,22 @@
         <w:t xml:space="preserve"> </w:t>
       </w:r>
       <w:r>
-        <w:t xml:space="preserve">flip-flop is reset by</w:t>
+        <w:t xml:space="preserve">flip-flop,</w:t>
+      </w:r>
+      <w:r>
+        <w:t xml:space="preserve"> </w:t>
+      </w:r>
+      <w:r>
+        <w:rPr>
+          <w:rStyle w:val="VerbatimChar"/>
+        </w:rPr>
+        <w:t xml:space="preserve">CNT</w:t>
+      </w:r>
+      <w:r>
+        <w:t xml:space="preserve"> </w:t>
+      </w:r>
+      <w:r>
+        <w:t xml:space="preserve">included, is reset to 0 by</w:t>
       </w:r>
       <w:r>
         <w:t xml:space="preserve"> </w:t>
@@ -9160,22 +9261,7 @@
         <w:jc w:val="left"/>
       </w:pPr>
       <w:r>
-        <w:t xml:space="preserve">On power-on,</w:t>
-      </w:r>
-      <w:r>
-        <w:t xml:space="preserve"> </w:t>
-      </w:r>
-      <w:r>
-        <w:rPr>
-          <w:rStyle w:val="VerbatimChar"/>
-        </w:rPr>
-        <w:t xml:space="preserve">CNT</w:t>
-      </w:r>
-      <w:r>
-        <w:t xml:space="preserve"> </w:t>
-      </w:r>
-      <w:r>
-        <w:t xml:space="preserve">resets to 15 and the flip-flop to 0:</w:t>
+        <w:t xml:space="preserve">On power-on there is no stretch:</w:t>
       </w:r>
       <w:r>
         <w:t xml:space="preserve"> </w:t>
@@ -9190,13 +9276,7 @@
         <w:t xml:space="preserve"> </w:t>
       </w:r>
       <w:r>
-        <w:t xml:space="preserve">releases</w:t>
-      </w:r>
-      <w:r>
-        <w:t xml:space="preserve"> </w:t>
-      </w:r>
-      <w:r>
-        <w:t xml:space="preserve">16 cycles after</w:t>
+        <w:t xml:space="preserve">releases one cycle after</w:t>
       </w:r>
       <w:r>
         <w:t xml:space="preserve"> </w:t>
@@ -9208,7 +9288,22 @@
         <w:t xml:space="preserve">w_rst_n_por</w:t>
       </w:r>
       <w:r>
-        <w:t xml:space="preserve">.</w:t>
+        <w:t xml:space="preserve">. None is needed, because every domain stays in reset through</w:t>
+      </w:r>
+      <w:r>
+        <w:t xml:space="preserve"> </w:t>
+      </w:r>
+      <w:r>
+        <w:rPr>
+          <w:rStyle w:val="VerbatimChar"/>
+        </w:rPr>
+        <w:t xml:space="preserve">RST_REL</w:t>
+      </w:r>
+      <w:r>
+        <w:t xml:space="preserve"> </w:t>
+      </w:r>
+      <w:r>
+        <w:t xml:space="preserve">= 0 until the program of 7.5 releases it.</w:t>
       </w:r>
     </w:p>
     <w:p>
@@ -15543,13 +15638,31 @@
         <w:t xml:space="preserve"> </w:t>
       </w:r>
       <w:r>
-        <w:t xml:space="preserve">and the name fails Naming Rule 2.1. Options: rename the generated files, or</w:t>
-      </w:r>
-      <w:r>
-        <w:t xml:space="preserve"> </w:t>
-      </w:r>
-      <w:r>
-        <w:t xml:space="preserve">replace the 2:1 bus with a hand-written arbiter. SCRC owner with the bus owner.</w:t>
+        <w:t xml:space="preserve">and the name fails Naming Rule 2.1. The generator stays (the mentor’s design);</w:t>
+      </w:r>
+      <w:r>
+        <w:t xml:space="preserve"> </w:t>
+      </w:r>
+      <w:r>
+        <w:t xml:space="preserve">the generated module is renamed when it is committed to</w:t>
+      </w:r>
+      <w:r>
+        <w:t xml:space="preserve"> </w:t>
+      </w:r>
+      <w:r>
+        <w:rPr>
+          <w:rStyle w:val="VerbatimChar"/>
+        </w:rPr>
+        <w:t xml:space="preserve">util/gen</w:t>
+      </w:r>
+      <w:r>
+        <w:t xml:space="preserve">, with the</w:t>
+      </w:r>
+      <w:r>
+        <w:t xml:space="preserve"> </w:t>
+      </w:r>
+      <w:r>
+        <w:t xml:space="preserve">command. SCRC owner with the bus owner.</w:t>
       </w:r>
     </w:p>
     <w:p>
@@ -15621,13 +15734,7 @@
         <w:pStyle w:val="FirstParagraph"/>
       </w:pPr>
       <w:r>
-        <w:t xml:space="preserve">Proposals under review (SCRC owner; the first also with the mentor), detail in</w:t>
-      </w:r>
-      <w:r>
-        <w:t xml:space="preserve"> </w:t>
-      </w:r>
-      <w:r>
-        <w:t xml:space="preserve">DECISIONS 4. Neither changes any other block, the address map or firmware:</w:t>
+        <w:t xml:space="preserve">Accepted limits:</w:t>
       </w:r>
     </w:p>
     <w:p>
@@ -15640,107 +15747,22 @@
         <w:jc w:val="left"/>
       </w:pPr>
       <w:r>
-        <w:rPr>
-          <w:b/>
-          <w:bCs/>
-        </w:rPr>
-        <w:t xml:space="preserve">Two CSRs instead of APB BUS + WFs.</w:t>
-      </w:r>
-      <w:r>
-        <w:t xml:space="preserve"> </w:t>
-      </w:r>
-      <w:r>
-        <w:rPr>
-          <w:rStyle w:val="VerbatimChar"/>
-        </w:rPr>
-        <w:t xml:space="preserve">CSR_I</w:t>
-      </w:r>
-      <w:r>
-        <w:t xml:space="preserve"> </w:t>
-      </w:r>
-      <w:r>
-        <w:t xml:space="preserve">on</w:t>
-      </w:r>
-      <w:r>
-        <w:t xml:space="preserve"> </w:t>
-      </w:r>
-      <w:r>
-        <w:rPr>
-          <w:rStyle w:val="VerbatimChar"/>
-        </w:rPr>
-        <w:t xml:space="preserve">APB_M0</w:t>
-      </w:r>
-      <w:r>
-        <w:t xml:space="preserve">,</w:t>
-      </w:r>
-      <w:r>
-        <w:t xml:space="preserve"> </w:t>
-      </w:r>
-      <w:r>
-        <w:rPr>
-          <w:rStyle w:val="VerbatimChar"/>
-        </w:rPr>
-        <w:t xml:space="preserve">CSR_M</w:t>
-      </w:r>
-      <w:r>
-        <w:t xml:space="preserve"> </w:t>
-      </w:r>
-      <w:r>
-        <w:t xml:space="preserve">on</w:t>
-      </w:r>
-      <w:r>
-        <w:t xml:space="preserve"> </w:t>
-      </w:r>
-      <w:r>
-        <w:rPr>
-          <w:rStyle w:val="VerbatimChar"/>
-        </w:rPr>
-        <w:t xml:space="preserve">MCPU</w:t>
-      </w:r>
-      <w:r>
-        <w:t xml:space="preserve">,</w:t>
-      </w:r>
-      <w:r>
-        <w:t xml:space="preserve"> </w:t>
-      </w:r>
-      <w:r>
-        <w:t xml:space="preserve">each writable only by its master; the other side’s fields appear as</w:t>
-      </w:r>
-      <w:r>
-        <w:t xml:space="preserve"> </w:t>
-      </w:r>
-      <w:r>
-        <w:rPr>
-          <w:rStyle w:val="VerbatimChar"/>
-        </w:rPr>
-        <w:t xml:space="preserve">ro</w:t>
-      </w:r>
-      <w:r>
-        <w:t xml:space="preserve">. Removes</w:t>
-      </w:r>
-      <w:r>
-        <w:t xml:space="preserve"> </w:t>
-      </w:r>
-      <w:r>
-        <w:t xml:space="preserve">the APB BUS, both WFs and the name clash above. A wrong-side write is then</w:t>
-      </w:r>
-      <w:r>
-        <w:t xml:space="preserve"> </w:t>
-      </w:r>
-      <w:r>
-        <w:t xml:space="preserve">ignored instead of answered with</w:t>
-      </w:r>
-      <w:r>
-        <w:t xml:space="preserve"> </w:t>
-      </w:r>
-      <w:r>
-        <w:rPr>
-          <w:rStyle w:val="VerbatimChar"/>
-        </w:rPr>
-        <w:t xml:space="preserve">PSLVERR</w:t>
-      </w:r>
-      <w:r>
-        <w:t xml:space="preserve">.</w:t>
+        <w:t xml:space="preserve">One domain serves both SPI blocks: gating</w:t>
+      </w:r>
+      <w:r>
+        <w:t xml:space="preserve"> </w:t>
+      </w:r>
+      <w:r>
+        <w:rPr>
+          <w:rStyle w:val="VerbatimChar"/>
+        </w:rPr>
+        <w:t xml:space="preserve">spi</w:t>
+      </w:r>
+      <w:r>
+        <w:t xml:space="preserve"> </w:t>
+      </w:r>
+      <w:r>
+        <w:t xml:space="preserve">stops SPI Host and SPI Device together.</w:t>
       </w:r>
     </w:p>
     <w:p>
@@ -15753,67 +15775,139 @@
         <w:jc w:val="left"/>
       </w:pPr>
       <w:r>
-        <w:rPr>
-          <w:b/>
-          <w:bCs/>
-        </w:rPr>
-        <w:t xml:space="preserve">No stretch after POR.</w:t>
-      </w:r>
-      <w:r>
-        <w:t xml:space="preserve"> </w:t>
-      </w:r>
-      <w:r>
-        <w:t xml:space="preserve">Every</w:t>
-      </w:r>
-      <w:r>
-        <w:t xml:space="preserve"> </w:t>
-      </w:r>
-      <w:r>
-        <w:rPr>
-          <w:rStyle w:val="VerbatimChar"/>
-        </w:rPr>
-        <w:t xml:space="preserve">RRC</w:t>
-      </w:r>
-      <w:r>
-        <w:t xml:space="preserve"> </w:t>
-      </w:r>
-      <w:r>
-        <w:t xml:space="preserve">flip-flop resets to 0;</w:t>
-      </w:r>
-      <w:r>
-        <w:t xml:space="preserve"> </w:t>
-      </w:r>
-      <w:r>
-        <w:rPr>
-          <w:rStyle w:val="VerbatimChar"/>
-        </w:rPr>
-        <w:t xml:space="preserve">w_rst_n_sys</w:t>
-      </w:r>
-      <w:r>
-        <w:t xml:space="preserve"> </w:t>
-      </w:r>
-      <w:r>
-        <w:t xml:space="preserve">releases one cycle after</w:t>
-      </w:r>
-      <w:r>
-        <w:t xml:space="preserve"> </w:t>
-      </w:r>
-      <w:r>
-        <w:rPr>
-          <w:rStyle w:val="VerbatimChar"/>
-        </w:rPr>
-        <w:t xml:space="preserve">w_rst_n_por</w:t>
-      </w:r>
-      <w:r>
-        <w:t xml:space="preserve">. The 16-cycle stretch stays for WDT and SW.</w:t>
+        <w:t xml:space="preserve">Gating</w:t>
+      </w:r>
+      <w:r>
+        <w:t xml:space="preserve"> </w:t>
+      </w:r>
+      <w:r>
+        <w:rPr>
+          <w:rStyle w:val="VerbatimChar"/>
+        </w:rPr>
+        <w:t xml:space="preserve">spi</w:t>
+      </w:r>
+      <w:r>
+        <w:t xml:space="preserve"> </w:t>
+      </w:r>
+      <w:r>
+        <w:t xml:space="preserve">while an external host drives SPI Device</w:t>
+      </w:r>
+      <w:r>
+        <w:t xml:space="preserve"> </w:t>
+      </w:r>
+      <w:r>
+        <w:rPr>
+          <w:rStyle w:val="VerbatimChar"/>
+        </w:rPr>
+        <w:t xml:space="preserve">SCK</w:t>
+      </w:r>
+      <w:r>
+        <w:t xml:space="preserve"> </w:t>
+      </w:r>
+      <w:r>
+        <w:t xml:space="preserve">loses that transfer: SPI Device needs its core clock at &gt;= 1/4 of</w:t>
+      </w:r>
+      <w:r>
+        <w:t xml:space="preserve"> </w:t>
+      </w:r>
+      <w:r>
+        <w:rPr>
+          <w:rStyle w:val="VerbatimChar"/>
+        </w:rPr>
+        <w:t xml:space="preserve">SCK</w:t>
+      </w:r>
+      <w:r>
+        <w:t xml:space="preserve">.</w:t>
       </w:r>
     </w:p>
     <w:p>
       <w:pPr>
-        <w:pStyle w:val="FirstParagraph"/>
-      </w:pPr>
-      <w:r>
-        <w:t xml:space="preserve">Accepted limits:</w:t>
+        <w:pStyle w:val="Compact"/>
+        <w:numPr>
+          <w:ilvl w:val="0"/>
+          <w:numId w:val="1013"/>
+        </w:numPr>
+        <w:jc w:val="left"/>
+      </w:pPr>
+      <w:r>
+        <w:t xml:space="preserve">The</w:t>
+      </w:r>
+      <w:r>
+        <w:t xml:space="preserve"> </w:t>
+      </w:r>
+      <w:r>
+        <w:rPr>
+          <w:rStyle w:val="VerbatimChar"/>
+        </w:rPr>
+        <w:t xml:space="preserve">dma</w:t>
+      </w:r>
+      <w:r>
+        <w:t xml:space="preserve"> </w:t>
+      </w:r>
+      <w:r>
+        <w:t xml:space="preserve">guard covers the configuration port only, not DMA transfers already</w:t>
+      </w:r>
+      <w:r>
+        <w:t xml:space="preserve"> </w:t>
+      </w:r>
+      <w:r>
+        <w:t xml:space="preserve">issued on</w:t>
+      </w:r>
+      <w:r>
+        <w:t xml:space="preserve"> </w:t>
+      </w:r>
+      <w:r>
+        <w:rPr>
+          <w:rStyle w:val="VerbatimChar"/>
+        </w:rPr>
+        <w:t xml:space="preserve">S_BUS</w:t>
+      </w:r>
+      <w:r>
+        <w:t xml:space="preserve">.</w:t>
+      </w:r>
+    </w:p>
+    <w:p>
+      <w:pPr>
+        <w:pStyle w:val="Compact"/>
+        <w:numPr>
+          <w:ilvl w:val="0"/>
+          <w:numId w:val="1013"/>
+        </w:numPr>
+        <w:jc w:val="left"/>
+      </w:pPr>
+      <w:r>
+        <w:t xml:space="preserve">A peripheral that holds</w:t>
+      </w:r>
+      <w:r>
+        <w:t xml:space="preserve"> </w:t>
+      </w:r>
+      <w:r>
+        <w:rPr>
+          <w:rStyle w:val="VerbatimChar"/>
+        </w:rPr>
+        <w:t xml:space="preserve">PREADY</w:t>
+      </w:r>
+      <w:r>
+        <w:t xml:space="preserve"> </w:t>
+      </w:r>
+      <w:r>
+        <w:t xml:space="preserve">low while not blocked stalls Ibex; only the</w:t>
+      </w:r>
+      <w:r>
+        <w:t xml:space="preserve"> </w:t>
+      </w:r>
+      <w:r>
+        <w:t xml:space="preserve">watchdog recovers it.</w:t>
+      </w:r>
+    </w:p>
+    <w:bookmarkEnd w:id="83"/>
+    <w:bookmarkStart w:id="84" w:name="verification"/>
+    <w:p>
+      <w:pPr>
+        <w:pStyle w:val="Heading1"/>
+      </w:pPr>
+      <w:r>
+        <w:t xml:space="preserve">12. Verification</w:t>
       </w:r>
     </w:p>
     <w:p>
@@ -15826,22 +15920,31 @@
         <w:jc w:val="left"/>
       </w:pPr>
       <w:r>
-        <w:t xml:space="preserve">One domain serves both SPI blocks: gating</w:t>
-      </w:r>
-      <w:r>
-        <w:t xml:space="preserve"> </w:t>
-      </w:r>
-      <w:r>
-        <w:rPr>
-          <w:rStyle w:val="VerbatimChar"/>
-        </w:rPr>
-        <w:t xml:space="preserve">spi</w:t>
-      </w:r>
-      <w:r>
-        <w:t xml:space="preserve"> </w:t>
-      </w:r>
-      <w:r>
-        <w:t xml:space="preserve">stops SPI Host and SPI Device together.</w:t>
+        <w:rPr>
+          <w:rStyle w:val="VerbatimChar"/>
+        </w:rPr>
+        <w:t xml:space="preserve">SCRC_CLK_001</w:t>
+      </w:r>
+      <w:r>
+        <w:t xml:space="preserve"> </w:t>
+      </w:r>
+      <w:r>
+        <w:t xml:space="preserve">Every output clock equals the root clock while its</w:t>
+      </w:r>
+      <w:r>
+        <w:t xml:space="preserve"> </w:t>
+      </w:r>
+      <w:r>
+        <w:rPr>
+          <w:rStyle w:val="VerbatimChar"/>
+        </w:rPr>
+        <w:t xml:space="preserve">CTRL</w:t>
+      </w:r>
+      <w:r>
+        <w:t xml:space="preserve"> </w:t>
+      </w:r>
+      <w:r>
+        <w:t xml:space="preserve">is enabled.</w:t>
       </w:r>
     </w:p>
     <w:p>
@@ -15854,49 +15957,31 @@
         <w:jc w:val="left"/>
       </w:pPr>
       <w:r>
-        <w:t xml:space="preserve">Gating</w:t>
-      </w:r>
-      <w:r>
-        <w:t xml:space="preserve"> </w:t>
-      </w:r>
-      <w:r>
-        <w:rPr>
-          <w:rStyle w:val="VerbatimChar"/>
-        </w:rPr>
-        <w:t xml:space="preserve">spi</w:t>
-      </w:r>
-      <w:r>
-        <w:t xml:space="preserve"> </w:t>
-      </w:r>
-      <w:r>
-        <w:t xml:space="preserve">while an external host drives SPI Device</w:t>
-      </w:r>
-      <w:r>
-        <w:t xml:space="preserve"> </w:t>
-      </w:r>
-      <w:r>
-        <w:rPr>
-          <w:rStyle w:val="VerbatimChar"/>
-        </w:rPr>
-        <w:t xml:space="preserve">SCK</w:t>
-      </w:r>
-      <w:r>
-        <w:t xml:space="preserve"> </w:t>
-      </w:r>
-      <w:r>
-        <w:t xml:space="preserve">loses that transfer: SPI Device needs its core clock at &gt;= 1/4 of</w:t>
-      </w:r>
-      <w:r>
-        <w:t xml:space="preserve"> </w:t>
-      </w:r>
-      <w:r>
-        <w:rPr>
-          <w:rStyle w:val="VerbatimChar"/>
-        </w:rPr>
-        <w:t xml:space="preserve">SCK</w:t>
-      </w:r>
-      <w:r>
-        <w:t xml:space="preserve">.</w:t>
+        <w:rPr>
+          <w:rStyle w:val="VerbatimChar"/>
+        </w:rPr>
+        <w:t xml:space="preserve">SCRC_CLK_002</w:t>
+      </w:r>
+      <w:r>
+        <w:t xml:space="preserve"> </w:t>
+      </w:r>
+      <w:r>
+        <w:t xml:space="preserve">The seven always-on clocks,</w:t>
+      </w:r>
+      <w:r>
+        <w:t xml:space="preserve"> </w:t>
+      </w:r>
+      <w:r>
+        <w:rPr>
+          <w:rStyle w:val="VerbatimChar"/>
+        </w:rPr>
+        <w:t xml:space="preserve">wdt</w:t>
+      </w:r>
+      <w:r>
+        <w:t xml:space="preserve"> </w:t>
+      </w:r>
+      <w:r>
+        <w:t xml:space="preserve">included, never stop, for any register value.</w:t>
       </w:r>
     </w:p>
     <w:p>
@@ -15909,37 +15994,25 @@
         <w:jc w:val="left"/>
       </w:pPr>
       <w:r>
-        <w:t xml:space="preserve">The</w:t>
-      </w:r>
-      <w:r>
-        <w:t xml:space="preserve"> </w:t>
-      </w:r>
-      <w:r>
-        <w:rPr>
-          <w:rStyle w:val="VerbatimChar"/>
-        </w:rPr>
-        <w:t xml:space="preserve">dma</w:t>
-      </w:r>
-      <w:r>
-        <w:t xml:space="preserve"> </w:t>
-      </w:r>
-      <w:r>
-        <w:t xml:space="preserve">guard covers the configuration port only, not DMA transfers already</w:t>
-      </w:r>
-      <w:r>
-        <w:t xml:space="preserve"> </w:t>
-      </w:r>
-      <w:r>
-        <w:t xml:space="preserve">issued on</w:t>
-      </w:r>
-      <w:r>
-        <w:t xml:space="preserve"> </w:t>
-      </w:r>
-      <w:r>
-        <w:rPr>
-          <w:rStyle w:val="VerbatimChar"/>
-        </w:rPr>
-        <w:t xml:space="preserve">S_BUS</w:t>
+        <w:rPr>
+          <w:rStyle w:val="VerbatimChar"/>
+        </w:rPr>
+        <w:t xml:space="preserve">SCRC_CLK_003</w:t>
+      </w:r>
+      <w:r>
+        <w:t xml:space="preserve"> </w:t>
+      </w:r>
+      <w:r>
+        <w:t xml:space="preserve">After any chip reset every gateable clock runs except</w:t>
+      </w:r>
+      <w:r>
+        <w:t xml:space="preserve"> </w:t>
+      </w:r>
+      <w:r>
+        <w:rPr>
+          <w:rStyle w:val="VerbatimChar"/>
+        </w:rPr>
+        <w:t xml:space="preserve">timer_1</w:t>
       </w:r>
       <w:r>
         <w:t xml:space="preserve">.</w:t>
@@ -15955,38 +16028,85 @@
         <w:jc w:val="left"/>
       </w:pPr>
       <w:r>
-        <w:t xml:space="preserve">A peripheral that holds</w:t>
-      </w:r>
-      <w:r>
-        <w:t xml:space="preserve"> </w:t>
-      </w:r>
-      <w:r>
-        <w:rPr>
-          <w:rStyle w:val="VerbatimChar"/>
-        </w:rPr>
-        <w:t xml:space="preserve">PREADY</w:t>
-      </w:r>
-      <w:r>
-        <w:t xml:space="preserve"> </w:t>
-      </w:r>
-      <w:r>
-        <w:t xml:space="preserve">low while not blocked stalls Ibex; only the</w:t>
-      </w:r>
-      <w:r>
-        <w:t xml:space="preserve"> </w:t>
-      </w:r>
-      <w:r>
-        <w:t xml:space="preserve">watchdog recovers it.</w:t>
-      </w:r>
-    </w:p>
-    <w:bookmarkEnd w:id="83"/>
-    <w:bookmarkStart w:id="84" w:name="verification"/>
-    <w:p>
-      <w:pPr>
-        <w:pStyle w:val="Heading1"/>
-      </w:pPr>
-      <w:r>
-        <w:t xml:space="preserve">12. Verification</w:t>
+        <w:rPr>
+          <w:rStyle w:val="VerbatimChar"/>
+        </w:rPr>
+        <w:t xml:space="preserve">SCRC_RST_001</w:t>
+      </w:r>
+      <w:r>
+        <w:t xml:space="preserve"> </w:t>
+      </w:r>
+      <w:r>
+        <w:t xml:space="preserve">A WDT bite and</w:t>
+      </w:r>
+      <w:r>
+        <w:t xml:space="preserve"> </w:t>
+      </w:r>
+      <w:r>
+        <w:rPr>
+          <w:rStyle w:val="VerbatimChar"/>
+        </w:rPr>
+        <w:t xml:space="preserve">SW_RST</w:t>
+      </w:r>
+      <w:r>
+        <w:t xml:space="preserve"> </w:t>
+      </w:r>
+      <w:r>
+        <w:t xml:space="preserve">each hold</w:t>
+      </w:r>
+      <w:r>
+        <w:t xml:space="preserve"> </w:t>
+      </w:r>
+      <w:r>
+        <w:rPr>
+          <w:rStyle w:val="VerbatimChar"/>
+        </w:rPr>
+        <w:t xml:space="preserve">w_rst_n_sys</w:t>
+      </w:r>
+      <w:r>
+        <w:t xml:space="preserve"> </w:t>
+      </w:r>
+      <w:r>
+        <w:t xml:space="preserve">low for exactly</w:t>
+      </w:r>
+      <w:r>
+        <w:t xml:space="preserve"> </w:t>
+      </w:r>
+      <w:r>
+        <w:t xml:space="preserve">16 cycles; after POR it releases one cycle after</w:t>
+      </w:r>
+      <w:r>
+        <w:t xml:space="preserve"> </w:t>
+      </w:r>
+      <w:r>
+        <w:rPr>
+          <w:rStyle w:val="VerbatimChar"/>
+        </w:rPr>
+        <w:t xml:space="preserve">w_rst_n_por</w:t>
+      </w:r>
+      <w:r>
+        <w:t xml:space="preserve">. Each asserts</w:t>
+      </w:r>
+      <w:r>
+        <w:t xml:space="preserve"> </w:t>
+      </w:r>
+      <w:r>
+        <w:t xml:space="preserve">every domain reset except</w:t>
+      </w:r>
+      <w:r>
+        <w:t xml:space="preserve"> </w:t>
+      </w:r>
+      <w:r>
+        <w:rPr>
+          <w:rStyle w:val="VerbatimChar"/>
+        </w:rPr>
+        <w:t xml:space="preserve">sysdbg</w:t>
+      </w:r>
+      <w:r>
+        <w:t xml:space="preserve"> </w:t>
+      </w:r>
+      <w:r>
+        <w:t xml:space="preserve">(WDT, SW).</w:t>
       </w:r>
     </w:p>
     <w:p>
@@ -15994,7 +16114,7 @@
         <w:pStyle w:val="Compact"/>
         <w:numPr>
           <w:ilvl w:val="0"/>
-          <w:numId w:val="1015"/>
+          <w:numId w:val="1014"/>
         </w:numPr>
         <w:jc w:val="left"/>
       </w:pPr>
@@ -16002,28 +16122,13 @@
         <w:rPr>
           <w:rStyle w:val="VerbatimChar"/>
         </w:rPr>
-        <w:t xml:space="preserve">SCRC_CLK_001</w:t>
-      </w:r>
-      <w:r>
-        <w:t xml:space="preserve"> </w:t>
-      </w:r>
-      <w:r>
-        <w:t xml:space="preserve">Every output clock equals the root clock while its</w:t>
-      </w:r>
-      <w:r>
-        <w:t xml:space="preserve"> </w:t>
-      </w:r>
-      <w:r>
-        <w:rPr>
-          <w:rStyle w:val="VerbatimChar"/>
-        </w:rPr>
-        <w:t xml:space="preserve">CTRL</w:t>
-      </w:r>
-      <w:r>
-        <w:t xml:space="preserve"> </w:t>
-      </w:r>
-      <w:r>
-        <w:t xml:space="preserve">is enabled.</w:t>
+        <w:t xml:space="preserve">SCRC_RST_002</w:t>
+      </w:r>
+      <w:r>
+        <w:t xml:space="preserve"> </w:t>
+      </w:r>
+      <w:r>
+        <w:t xml:space="preserve">Each domain reset releases 2 domain-clock edges after its input rises.</w:t>
       </w:r>
     </w:p>
     <w:p>
@@ -16031,7 +16136,7 @@
         <w:pStyle w:val="Compact"/>
         <w:numPr>
           <w:ilvl w:val="0"/>
-          <w:numId w:val="1015"/>
+          <w:numId w:val="1014"/>
         </w:numPr>
         <w:jc w:val="left"/>
       </w:pPr>
@@ -16039,28 +16144,34 @@
         <w:rPr>
           <w:rStyle w:val="VerbatimChar"/>
         </w:rPr>
-        <w:t xml:space="preserve">SCRC_CLK_002</w:t>
-      </w:r>
-      <w:r>
-        <w:t xml:space="preserve"> </w:t>
-      </w:r>
-      <w:r>
-        <w:t xml:space="preserve">The seven always-on clocks,</w:t>
-      </w:r>
-      <w:r>
-        <w:t xml:space="preserve"> </w:t>
-      </w:r>
-      <w:r>
-        <w:rPr>
-          <w:rStyle w:val="VerbatimChar"/>
-        </w:rPr>
-        <w:t xml:space="preserve">wdt</w:t>
-      </w:r>
-      <w:r>
-        <w:t xml:space="preserve"> </w:t>
-      </w:r>
-      <w:r>
-        <w:t xml:space="preserve">included, never stop, for any register value.</w:t>
+        <w:t xml:space="preserve">SCRC_RST_003</w:t>
+      </w:r>
+      <w:r>
+        <w:t xml:space="preserve"> </w:t>
+      </w:r>
+      <w:r>
+        <w:t xml:space="preserve">All non-CPU domains release in the same cycle; the CPU releases</w:t>
+      </w:r>
+      <w:r>
+        <w:t xml:space="preserve"> </w:t>
+      </w:r>
+      <w:r>
+        <w:t xml:space="preserve">&gt;= 16 cycles later and after</w:t>
+      </w:r>
+      <w:r>
+        <w:t xml:space="preserve"> </w:t>
+      </w:r>
+      <w:r>
+        <w:rPr>
+          <w:rStyle w:val="VerbatimChar"/>
+        </w:rPr>
+        <w:t xml:space="preserve">APB_BLK</w:t>
+      </w:r>
+      <w:r>
+        <w:t xml:space="preserve"> </w:t>
+      </w:r>
+      <w:r>
+        <w:t xml:space="preserve">is written.</w:t>
       </w:r>
     </w:p>
     <w:p>
@@ -16068,7 +16179,7 @@
         <w:pStyle w:val="Compact"/>
         <w:numPr>
           <w:ilvl w:val="0"/>
-          <w:numId w:val="1015"/>
+          <w:numId w:val="1014"/>
         </w:numPr>
         <w:jc w:val="left"/>
       </w:pPr>
@@ -16076,22 +16187,52 @@
         <w:rPr>
           <w:rStyle w:val="VerbatimChar"/>
         </w:rPr>
-        <w:t xml:space="preserve">SCRC_CLK_003</w:t>
-      </w:r>
-      <w:r>
-        <w:t xml:space="preserve"> </w:t>
-      </w:r>
-      <w:r>
-        <w:t xml:space="preserve">After any chip reset every gateable clock runs except</w:t>
-      </w:r>
-      <w:r>
-        <w:t xml:space="preserve"> </w:t>
-      </w:r>
-      <w:r>
-        <w:rPr>
-          <w:rStyle w:val="VerbatimChar"/>
-        </w:rPr>
-        <w:t xml:space="preserve">timer_1</w:t>
+        <w:t xml:space="preserve">SCRC_RST_004</w:t>
+      </w:r>
+      <w:r>
+        <w:t xml:space="preserve"> </w:t>
+      </w:r>
+      <w:r>
+        <w:t xml:space="preserve">With</w:t>
+      </w:r>
+      <w:r>
+        <w:t xml:space="preserve"> </w:t>
+      </w:r>
+      <w:r>
+        <w:rPr>
+          <w:rStyle w:val="VerbatimChar"/>
+        </w:rPr>
+        <w:t xml:space="preserve">i_dbg_cpu_hold</w:t>
+      </w:r>
+      <w:r>
+        <w:t xml:space="preserve"> </w:t>
+      </w:r>
+      <w:r>
+        <w:t xml:space="preserve">= 1,</w:t>
+      </w:r>
+      <w:r>
+        <w:t xml:space="preserve"> </w:t>
+      </w:r>
+      <w:r>
+        <w:rPr>
+          <w:rStyle w:val="VerbatimChar"/>
+        </w:rPr>
+        <w:t xml:space="preserve">o_rst_n_cpu</w:t>
+      </w:r>
+      <w:r>
+        <w:t xml:space="preserve"> </w:t>
+      </w:r>
+      <w:r>
+        <w:t xml:space="preserve">stays 0 for any</w:t>
+      </w:r>
+      <w:r>
+        <w:t xml:space="preserve"> </w:t>
+      </w:r>
+      <w:r>
+        <w:rPr>
+          <w:rStyle w:val="VerbatimChar"/>
+        </w:rPr>
+        <w:t xml:space="preserve">RST_REL[31]</w:t>
       </w:r>
       <w:r>
         <w:t xml:space="preserve">.</w:t>
@@ -16102,7 +16243,7 @@
         <w:pStyle w:val="Compact"/>
         <w:numPr>
           <w:ilvl w:val="0"/>
-          <w:numId w:val="1015"/>
+          <w:numId w:val="1014"/>
         </w:numPr>
         <w:jc w:val="left"/>
       </w:pPr>
@@ -16110,82 +16251,52 @@
         <w:rPr>
           <w:rStyle w:val="VerbatimChar"/>
         </w:rPr>
-        <w:t xml:space="preserve">SCRC_RST_001</w:t>
-      </w:r>
-      <w:r>
-        <w:t xml:space="preserve"> </w:t>
-      </w:r>
-      <w:r>
-        <w:t xml:space="preserve">A WDT bite and</w:t>
-      </w:r>
-      <w:r>
-        <w:t xml:space="preserve"> </w:t>
-      </w:r>
-      <w:r>
-        <w:rPr>
-          <w:rStyle w:val="VerbatimChar"/>
-        </w:rPr>
-        <w:t xml:space="preserve">SW_RST</w:t>
-      </w:r>
-      <w:r>
-        <w:t xml:space="preserve"> </w:t>
-      </w:r>
-      <w:r>
-        <w:t xml:space="preserve">each hold</w:t>
-      </w:r>
-      <w:r>
-        <w:t xml:space="preserve"> </w:t>
-      </w:r>
-      <w:r>
-        <w:rPr>
-          <w:rStyle w:val="VerbatimChar"/>
-        </w:rPr>
-        <w:t xml:space="preserve">w_rst_n_sys</w:t>
-      </w:r>
-      <w:r>
-        <w:t xml:space="preserve"> </w:t>
-      </w:r>
-      <w:r>
-        <w:t xml:space="preserve">low for exactly</w:t>
-      </w:r>
-      <w:r>
-        <w:t xml:space="preserve"> </w:t>
-      </w:r>
-      <w:r>
-        <w:t xml:space="preserve">16 cycles; after POR it releases 16 cycles after</w:t>
-      </w:r>
-      <w:r>
-        <w:t xml:space="preserve"> </w:t>
-      </w:r>
-      <w:r>
-        <w:rPr>
-          <w:rStyle w:val="VerbatimChar"/>
-        </w:rPr>
-        <w:t xml:space="preserve">w_rst_n_por</w:t>
-      </w:r>
-      <w:r>
-        <w:t xml:space="preserve">. Each asserts</w:t>
-      </w:r>
-      <w:r>
-        <w:t xml:space="preserve"> </w:t>
-      </w:r>
-      <w:r>
-        <w:t xml:space="preserve">every domain reset except</w:t>
-      </w:r>
-      <w:r>
-        <w:t xml:space="preserve"> </w:t>
-      </w:r>
-      <w:r>
-        <w:rPr>
-          <w:rStyle w:val="VerbatimChar"/>
-        </w:rPr>
-        <w:t xml:space="preserve">sysdbg</w:t>
-      </w:r>
-      <w:r>
-        <w:t xml:space="preserve"> </w:t>
-      </w:r>
-      <w:r>
-        <w:t xml:space="preserve">(WDT, SW).</w:t>
+        <w:t xml:space="preserve">SCRC_RST_005</w:t>
+      </w:r>
+      <w:r>
+        <w:t xml:space="preserve"> </w:t>
+      </w:r>
+      <w:r>
+        <w:t xml:space="preserve">WDT and SW resets do not change</w:t>
+      </w:r>
+      <w:r>
+        <w:t xml:space="preserve"> </w:t>
+      </w:r>
+      <w:r>
+        <w:rPr>
+          <w:rStyle w:val="VerbatimChar"/>
+        </w:rPr>
+        <w:t xml:space="preserve">RRC</w:t>
+      </w:r>
+      <w:r>
+        <w:t xml:space="preserve">,</w:t>
+      </w:r>
+      <w:r>
+        <w:t xml:space="preserve"> </w:t>
+      </w:r>
+      <w:r>
+        <w:rPr>
+          <w:rStyle w:val="VerbatimChar"/>
+        </w:rPr>
+        <w:t xml:space="preserve">o_rst_n_por</w:t>
+      </w:r>
+      <w:r>
+        <w:t xml:space="preserve"> </w:t>
+      </w:r>
+      <w:r>
+        <w:t xml:space="preserve">or</w:t>
+      </w:r>
+      <w:r>
+        <w:t xml:space="preserve"> </w:t>
+      </w:r>
+      <w:r>
+        <w:rPr>
+          <w:rStyle w:val="VerbatimChar"/>
+        </w:rPr>
+        <w:t xml:space="preserve">o_rst_n_sysdbg</w:t>
+      </w:r>
+      <w:r>
+        <w:t xml:space="preserve">.</w:t>
       </w:r>
     </w:p>
     <w:p>
@@ -16193,7 +16304,7 @@
         <w:pStyle w:val="Compact"/>
         <w:numPr>
           <w:ilvl w:val="0"/>
-          <w:numId w:val="1015"/>
+          <w:numId w:val="1014"/>
         </w:numPr>
         <w:jc w:val="left"/>
       </w:pPr>
@@ -16201,13 +16312,76 @@
         <w:rPr>
           <w:rStyle w:val="VerbatimChar"/>
         </w:rPr>
-        <w:t xml:space="preserve">SCRC_RST_002</w:t>
-      </w:r>
-      <w:r>
-        <w:t xml:space="preserve"> </w:t>
-      </w:r>
-      <w:r>
-        <w:t xml:space="preserve">Each domain reset releases 2 domain-clock edges after its input rises.</w:t>
+        <w:t xml:space="preserve">SCRC_RST_007</w:t>
+      </w:r>
+      <w:r>
+        <w:t xml:space="preserve"> </w:t>
+      </w:r>
+      <w:r>
+        <w:t xml:space="preserve">Before the CPU reset releases,</w:t>
+      </w:r>
+      <w:r>
+        <w:t xml:space="preserve"> </w:t>
+      </w:r>
+      <w:r>
+        <w:rPr>
+          <w:rStyle w:val="VerbatimChar"/>
+        </w:rPr>
+        <w:t xml:space="preserve">APB_BLK</w:t>
+      </w:r>
+      <w:r>
+        <w:t xml:space="preserve"> </w:t>
+      </w:r>
+      <w:r>
+        <w:t xml:space="preserve">= NOT</w:t>
+      </w:r>
+      <w:r>
+        <w:t xml:space="preserve"> </w:t>
+      </w:r>
+      <w:r>
+        <w:rPr>
+          <w:rStyle w:val="VerbatimChar"/>
+        </w:rPr>
+        <w:t xml:space="preserve">CLK_EN</w:t>
+      </w:r>
+      <w:r>
+        <w:t xml:space="preserve"> </w:t>
+      </w:r>
+      <w:r>
+        <w:t xml:space="preserve">on the</w:t>
+      </w:r>
+      <w:r>
+        <w:t xml:space="preserve"> </w:t>
+      </w:r>
+      <w:r>
+        <w:t xml:space="preserve">gateable bits; the boot ROM’s first</w:t>
+      </w:r>
+      <w:r>
+        <w:t xml:space="preserve"> </w:t>
+      </w:r>
+      <w:r>
+        <w:rPr>
+          <w:rStyle w:val="VerbatimChar"/>
+        </w:rPr>
+        <w:t xml:space="preserve">UART0</w:t>
+      </w:r>
+      <w:r>
+        <w:t xml:space="preserve"> </w:t>
+      </w:r>
+      <w:r>
+        <w:t xml:space="preserve">access completes without</w:t>
+      </w:r>
+      <w:r>
+        <w:t xml:space="preserve"> </w:t>
+      </w:r>
+      <w:r>
+        <w:rPr>
+          <w:rStyle w:val="VerbatimChar"/>
+        </w:rPr>
+        <w:t xml:space="preserve">PSLVERR</w:t>
+      </w:r>
+      <w:r>
+        <w:t xml:space="preserve">.</w:t>
       </w:r>
     </w:p>
     <w:p>
@@ -16215,7 +16389,7 @@
         <w:pStyle w:val="Compact"/>
         <w:numPr>
           <w:ilvl w:val="0"/>
-          <w:numId w:val="1015"/>
+          <w:numId w:val="1014"/>
         </w:numPr>
         <w:jc w:val="left"/>
       </w:pPr>
@@ -16223,34 +16397,49 @@
         <w:rPr>
           <w:rStyle w:val="VerbatimChar"/>
         </w:rPr>
-        <w:t xml:space="preserve">SCRC_RST_003</w:t>
-      </w:r>
-      <w:r>
-        <w:t xml:space="preserve"> </w:t>
-      </w:r>
-      <w:r>
-        <w:t xml:space="preserve">All non-CPU domains release in the same cycle; the CPU releases</w:t>
-      </w:r>
-      <w:r>
-        <w:t xml:space="preserve"> </w:t>
-      </w:r>
-      <w:r>
-        <w:t xml:space="preserve">&gt;= 16 cycles later and after</w:t>
-      </w:r>
-      <w:r>
-        <w:t xml:space="preserve"> </w:t>
-      </w:r>
-      <w:r>
-        <w:rPr>
-          <w:rStyle w:val="VerbatimChar"/>
-        </w:rPr>
-        <w:t xml:space="preserve">APB_BLK</w:t>
-      </w:r>
-      <w:r>
-        <w:t xml:space="preserve"> </w:t>
-      </w:r>
-      <w:r>
-        <w:t xml:space="preserve">is written.</w:t>
+        <w:t xml:space="preserve">SCRC_RST_008</w:t>
+      </w:r>
+      <w:r>
+        <w:t xml:space="preserve"> </w:t>
+      </w:r>
+      <w:r>
+        <w:t xml:space="preserve">After a chip reset,</w:t>
+      </w:r>
+      <w:r>
+        <w:t xml:space="preserve"> </w:t>
+      </w:r>
+      <w:r>
+        <w:rPr>
+          <w:rStyle w:val="VerbatimChar"/>
+        </w:rPr>
+        <w:t xml:space="preserve">o_rst_n_timer_1</w:t>
+      </w:r>
+      <w:r>
+        <w:t xml:space="preserve"> </w:t>
+      </w:r>
+      <w:r>
+        <w:t xml:space="preserve">= 0 until</w:t>
+      </w:r>
+      <w:r>
+        <w:t xml:space="preserve"> </w:t>
+      </w:r>
+      <w:r>
+        <w:rPr>
+          <w:rStyle w:val="VerbatimChar"/>
+        </w:rPr>
+        <w:t xml:space="preserve">CLK_EN[4]</w:t>
+      </w:r>
+      <w:r>
+        <w:t xml:space="preserve"> </w:t>
+      </w:r>
+      <w:r>
+        <w:t xml:space="preserve">is set,</w:t>
+      </w:r>
+      <w:r>
+        <w:t xml:space="preserve"> </w:t>
+      </w:r>
+      <w:r>
+        <w:t xml:space="preserve">then releases.</w:t>
       </w:r>
     </w:p>
     <w:p>
@@ -16258,7 +16447,7 @@
         <w:pStyle w:val="Compact"/>
         <w:numPr>
           <w:ilvl w:val="0"/>
-          <w:numId w:val="1015"/>
+          <w:numId w:val="1014"/>
         </w:numPr>
         <w:jc w:val="left"/>
       </w:pPr>
@@ -16266,55 +16455,49 @@
         <w:rPr>
           <w:rStyle w:val="VerbatimChar"/>
         </w:rPr>
-        <w:t xml:space="preserve">SCRC_RST_004</w:t>
-      </w:r>
-      <w:r>
-        <w:t xml:space="preserve"> </w:t>
-      </w:r>
-      <w:r>
-        <w:t xml:space="preserve">With</w:t>
-      </w:r>
-      <w:r>
-        <w:t xml:space="preserve"> </w:t>
-      </w:r>
-      <w:r>
-        <w:rPr>
-          <w:rStyle w:val="VerbatimChar"/>
-        </w:rPr>
-        <w:t xml:space="preserve">i_dbg_cpu_hold</w:t>
-      </w:r>
-      <w:r>
-        <w:t xml:space="preserve"> </w:t>
-      </w:r>
-      <w:r>
-        <w:t xml:space="preserve">= 1,</w:t>
-      </w:r>
-      <w:r>
-        <w:t xml:space="preserve"> </w:t>
-      </w:r>
-      <w:r>
-        <w:rPr>
-          <w:rStyle w:val="VerbatimChar"/>
-        </w:rPr>
-        <w:t xml:space="preserve">o_rst_n_cpu</w:t>
-      </w:r>
-      <w:r>
-        <w:t xml:space="preserve"> </w:t>
-      </w:r>
-      <w:r>
-        <w:t xml:space="preserve">stays 0 for any</w:t>
-      </w:r>
-      <w:r>
-        <w:t xml:space="preserve"> </w:t>
-      </w:r>
-      <w:r>
-        <w:rPr>
-          <w:rStyle w:val="VerbatimChar"/>
-        </w:rPr>
-        <w:t xml:space="preserve">RST_REL[31]</w:t>
-      </w:r>
-      <w:r>
-        <w:t xml:space="preserve">.</w:t>
+        <w:t xml:space="preserve">SCRC_RRC_001</w:t>
+      </w:r>
+      <w:r>
+        <w:t xml:space="preserve"> </w:t>
+      </w:r>
+      <w:r>
+        <w:t xml:space="preserve">A WDT request cleared by the reset it causes still gives one</w:t>
+      </w:r>
+      <w:r>
+        <w:t xml:space="preserve"> </w:t>
+      </w:r>
+      <w:r>
+        <w:t xml:space="preserve">16-cycle reset, with</w:t>
+      </w:r>
+      <w:r>
+        <w:t xml:space="preserve"> </w:t>
+      </w:r>
+      <w:r>
+        <w:rPr>
+          <w:rStyle w:val="VerbatimChar"/>
+        </w:rPr>
+        <w:t xml:space="preserve">o_cause_we_wdt</w:t>
+      </w:r>
+      <w:r>
+        <w:t xml:space="preserve"> </w:t>
+      </w:r>
+      <w:r>
+        <w:t xml:space="preserve">= 1 for exactly those 16 cycles and</w:t>
+      </w:r>
+      <w:r>
+        <w:t xml:space="preserve"> </w:t>
+      </w:r>
+      <w:r>
+        <w:rPr>
+          <w:rStyle w:val="VerbatimChar"/>
+        </w:rPr>
+        <w:t xml:space="preserve">o_cause_we_sw</w:t>
+      </w:r>
+      <w:r>
+        <w:t xml:space="preserve"> </w:t>
+      </w:r>
+      <w:r>
+        <w:t xml:space="preserve">= 0.</w:t>
       </w:r>
     </w:p>
     <w:p>
@@ -16322,7 +16505,7 @@
         <w:pStyle w:val="Compact"/>
         <w:numPr>
           <w:ilvl w:val="0"/>
-          <w:numId w:val="1015"/>
+          <w:numId w:val="1014"/>
         </w:numPr>
         <w:jc w:val="left"/>
       </w:pPr>
@@ -16330,52 +16513,49 @@
         <w:rPr>
           <w:rStyle w:val="VerbatimChar"/>
         </w:rPr>
-        <w:t xml:space="preserve">SCRC_RST_005</w:t>
-      </w:r>
-      <w:r>
-        <w:t xml:space="preserve"> </w:t>
-      </w:r>
-      <w:r>
-        <w:t xml:space="preserve">WDT and SW resets do not change</w:t>
-      </w:r>
-      <w:r>
-        <w:t xml:space="preserve"> </w:t>
-      </w:r>
-      <w:r>
-        <w:rPr>
-          <w:rStyle w:val="VerbatimChar"/>
-        </w:rPr>
-        <w:t xml:space="preserve">RRC</w:t>
-      </w:r>
-      <w:r>
-        <w:t xml:space="preserve">,</w:t>
-      </w:r>
-      <w:r>
-        <w:t xml:space="preserve"> </w:t>
-      </w:r>
-      <w:r>
-        <w:rPr>
-          <w:rStyle w:val="VerbatimChar"/>
-        </w:rPr>
-        <w:t xml:space="preserve">o_rst_n_por</w:t>
-      </w:r>
-      <w:r>
-        <w:t xml:space="preserve"> </w:t>
-      </w:r>
-      <w:r>
-        <w:t xml:space="preserve">or</w:t>
-      </w:r>
-      <w:r>
-        <w:t xml:space="preserve"> </w:t>
-      </w:r>
-      <w:r>
-        <w:rPr>
-          <w:rStyle w:val="VerbatimChar"/>
-        </w:rPr>
-        <w:t xml:space="preserve">o_rst_n_sysdbg</w:t>
-      </w:r>
-      <w:r>
-        <w:t xml:space="preserve">.</w:t>
+        <w:t xml:space="preserve">SCRC_FLT_001</w:t>
+      </w:r>
+      <w:r>
+        <w:t xml:space="preserve"> </w:t>
+      </w:r>
+      <w:r>
+        <w:t xml:space="preserve">A pulse on</w:t>
+      </w:r>
+      <w:r>
+        <w:t xml:space="preserve"> </w:t>
+      </w:r>
+      <w:r>
+        <w:rPr>
+          <w:rStyle w:val="VerbatimChar"/>
+        </w:rPr>
+        <w:t xml:space="preserve">i_rst_n_pad</w:t>
+      </w:r>
+      <w:r>
+        <w:t xml:space="preserve"> </w:t>
+      </w:r>
+      <w:r>
+        <w:t xml:space="preserve">shorter than the three-cell delay does not</w:t>
+      </w:r>
+      <w:r>
+        <w:t xml:space="preserve"> </w:t>
+      </w:r>
+      <w:r>
+        <w:t xml:space="preserve">change</w:t>
+      </w:r>
+      <w:r>
+        <w:t xml:space="preserve"> </w:t>
+      </w:r>
+      <w:r>
+        <w:rPr>
+          <w:rStyle w:val="VerbatimChar"/>
+        </w:rPr>
+        <w:t xml:space="preserve">w_rst_n_por</w:t>
+      </w:r>
+      <w:r>
+        <w:t xml:space="preserve"> </w:t>
+      </w:r>
+      <w:r>
+        <w:t xml:space="preserve">(gate-level simulation with library delays).</w:t>
       </w:r>
     </w:p>
     <w:p>
@@ -16383,7 +16563,7 @@
         <w:pStyle w:val="Compact"/>
         <w:numPr>
           <w:ilvl w:val="0"/>
-          <w:numId w:val="1015"/>
+          <w:numId w:val="1014"/>
         </w:numPr>
         <w:jc w:val="left"/>
       </w:pPr>
@@ -16391,64 +16571,13 @@
         <w:rPr>
           <w:rStyle w:val="VerbatimChar"/>
         </w:rPr>
-        <w:t xml:space="preserve">SCRC_RST_007</w:t>
-      </w:r>
-      <w:r>
-        <w:t xml:space="preserve"> </w:t>
-      </w:r>
-      <w:r>
-        <w:t xml:space="preserve">Before the CPU reset releases,</w:t>
-      </w:r>
-      <w:r>
-        <w:t xml:space="preserve"> </w:t>
-      </w:r>
-      <w:r>
-        <w:rPr>
-          <w:rStyle w:val="VerbatimChar"/>
-        </w:rPr>
-        <w:t xml:space="preserve">APB_BLK</w:t>
-      </w:r>
-      <w:r>
-        <w:t xml:space="preserve"> </w:t>
-      </w:r>
-      <w:r>
-        <w:t xml:space="preserve">= NOT</w:t>
-      </w:r>
-      <w:r>
-        <w:t xml:space="preserve"> </w:t>
-      </w:r>
-      <w:r>
-        <w:rPr>
-          <w:rStyle w:val="VerbatimChar"/>
-        </w:rPr>
-        <w:t xml:space="preserve">CLK_EN</w:t>
-      </w:r>
-      <w:r>
-        <w:t xml:space="preserve"> </w:t>
-      </w:r>
-      <w:r>
-        <w:t xml:space="preserve">on the</w:t>
-      </w:r>
-      <w:r>
-        <w:t xml:space="preserve"> </w:t>
-      </w:r>
-      <w:r>
-        <w:t xml:space="preserve">gateable bits; the boot ROM’s first</w:t>
-      </w:r>
-      <w:r>
-        <w:t xml:space="preserve"> </w:t>
-      </w:r>
-      <w:r>
-        <w:rPr>
-          <w:rStyle w:val="VerbatimChar"/>
-        </w:rPr>
-        <w:t xml:space="preserve">UART0</w:t>
-      </w:r>
-      <w:r>
-        <w:t xml:space="preserve"> </w:t>
-      </w:r>
-      <w:r>
-        <w:t xml:space="preserve">access completes without</w:t>
+        <w:t xml:space="preserve">SCRC_CSR_001</w:t>
+      </w:r>
+      <w:r>
+        <w:t xml:space="preserve"> </w:t>
+      </w:r>
+      <w:r>
+        <w:t xml:space="preserve">Every row of the</w:t>
       </w:r>
       <w:r>
         <w:t xml:space="preserve"> </w:t>
@@ -16460,7 +16589,16 @@
         <w:t xml:space="preserve">PSLVERR</w:t>
       </w:r>
       <w:r>
-        <w:t xml:space="preserve">.</w:t>
+        <w:t xml:space="preserve"> </w:t>
+      </w:r>
+      <w:r>
+        <w:t xml:space="preserve">table (7.4) gives the stated result, and a</w:t>
+      </w:r>
+      <w:r>
+        <w:t xml:space="preserve"> </w:t>
+      </w:r>
+      <w:r>
+        <w:t xml:space="preserve">dropped write changes no register.</w:t>
       </w:r>
     </w:p>
     <w:p>
@@ -16468,7 +16606,7 @@
         <w:pStyle w:val="Compact"/>
         <w:numPr>
           <w:ilvl w:val="0"/>
-          <w:numId w:val="1015"/>
+          <w:numId w:val="1014"/>
         </w:numPr>
         <w:jc w:val="left"/>
       </w:pPr>
@@ -16476,49 +16614,19 @@
         <w:rPr>
           <w:rStyle w:val="VerbatimChar"/>
         </w:rPr>
-        <w:t xml:space="preserve">SCRC_RST_008</w:t>
-      </w:r>
-      <w:r>
-        <w:t xml:space="preserve"> </w:t>
-      </w:r>
-      <w:r>
-        <w:t xml:space="preserve">After a chip reset,</w:t>
-      </w:r>
-      <w:r>
-        <w:t xml:space="preserve"> </w:t>
-      </w:r>
-      <w:r>
-        <w:rPr>
-          <w:rStyle w:val="VerbatimChar"/>
-        </w:rPr>
-        <w:t xml:space="preserve">o_rst_n_timer_1</w:t>
-      </w:r>
-      <w:r>
-        <w:t xml:space="preserve"> </w:t>
-      </w:r>
-      <w:r>
-        <w:t xml:space="preserve">= 0 until</w:t>
-      </w:r>
-      <w:r>
-        <w:t xml:space="preserve"> </w:t>
-      </w:r>
-      <w:r>
-        <w:rPr>
-          <w:rStyle w:val="VerbatimChar"/>
-        </w:rPr>
-        <w:t xml:space="preserve">CLK_EN[4]</w:t>
-      </w:r>
-      <w:r>
-        <w:t xml:space="preserve"> </w:t>
-      </w:r>
-      <w:r>
-        <w:t xml:space="preserve">is set,</w:t>
-      </w:r>
-      <w:r>
-        <w:t xml:space="preserve"> </w:t>
-      </w:r>
-      <w:r>
-        <w:t xml:space="preserve">then releases.</w:t>
+        <w:t xml:space="preserve">SCRC_CSR_002</w:t>
+      </w:r>
+      <w:r>
+        <w:t xml:space="preserve"> </w:t>
+      </w:r>
+      <w:r>
+        <w:t xml:space="preserve">Reset value, implemented bits and access of every register match</w:t>
+      </w:r>
+      <w:r>
+        <w:t xml:space="preserve"> </w:t>
+      </w:r>
+      <w:r>
+        <w:t xml:space="preserve">section 6, per master.</w:t>
       </w:r>
     </w:p>
     <w:p>
@@ -16526,7 +16634,7 @@
         <w:pStyle w:val="Compact"/>
         <w:numPr>
           <w:ilvl w:val="0"/>
-          <w:numId w:val="1015"/>
+          <w:numId w:val="1014"/>
         </w:numPr>
         <w:jc w:val="left"/>
       </w:pPr>
@@ -16534,49 +16642,43 @@
         <w:rPr>
           <w:rStyle w:val="VerbatimChar"/>
         </w:rPr>
-        <w:t xml:space="preserve">SCRC_RRC_001</w:t>
-      </w:r>
-      <w:r>
-        <w:t xml:space="preserve"> </w:t>
-      </w:r>
-      <w:r>
-        <w:t xml:space="preserve">A WDT request cleared by the reset it causes still gives one</w:t>
-      </w:r>
-      <w:r>
-        <w:t xml:space="preserve"> </w:t>
-      </w:r>
-      <w:r>
-        <w:t xml:space="preserve">16-cycle reset, with</w:t>
-      </w:r>
-      <w:r>
-        <w:t xml:space="preserve"> </w:t>
-      </w:r>
-      <w:r>
-        <w:rPr>
-          <w:rStyle w:val="VerbatimChar"/>
-        </w:rPr>
-        <w:t xml:space="preserve">o_cause_we_wdt</w:t>
-      </w:r>
-      <w:r>
-        <w:t xml:space="preserve"> </w:t>
-      </w:r>
-      <w:r>
-        <w:t xml:space="preserve">= 1 for exactly those 16 cycles and</w:t>
-      </w:r>
-      <w:r>
-        <w:t xml:space="preserve"> </w:t>
-      </w:r>
-      <w:r>
-        <w:rPr>
-          <w:rStyle w:val="VerbatimChar"/>
-        </w:rPr>
-        <w:t xml:space="preserve">o_cause_we_sw</w:t>
-      </w:r>
-      <w:r>
-        <w:t xml:space="preserve"> </w:t>
-      </w:r>
-      <w:r>
-        <w:t xml:space="preserve">= 0.</w:t>
+        <w:t xml:space="preserve">SCRC_SEQ_001</w:t>
+      </w:r>
+      <w:r>
+        <w:t xml:space="preserve"> </w:t>
+      </w:r>
+      <w:r>
+        <w:t xml:space="preserve">Any sequence of</w:t>
+      </w:r>
+      <w:r>
+        <w:t xml:space="preserve"> </w:t>
+      </w:r>
+      <w:r>
+        <w:rPr>
+          <w:rStyle w:val="VerbatimChar"/>
+        </w:rPr>
+        <w:t xml:space="preserve">CLK_EN</w:t>
+      </w:r>
+      <w:r>
+        <w:t xml:space="preserve"> </w:t>
+      </w:r>
+      <w:r>
+        <w:t xml:space="preserve">writes, back to back included, ends with</w:t>
+      </w:r>
+      <w:r>
+        <w:t xml:space="preserve"> </w:t>
+      </w:r>
+      <w:r>
+        <w:rPr>
+          <w:rStyle w:val="VerbatimChar"/>
+        </w:rPr>
+        <w:t xml:space="preserve">ICG_EN</w:t>
+      </w:r>
+      <w:r>
+        <w:t xml:space="preserve"> </w:t>
+      </w:r>
+      <w:r>
+        <w:t xml:space="preserve">= the last value written.</w:t>
       </w:r>
     </w:p>
     <w:p>
@@ -16584,7 +16686,7 @@
         <w:pStyle w:val="Compact"/>
         <w:numPr>
           <w:ilvl w:val="0"/>
-          <w:numId w:val="1015"/>
+          <w:numId w:val="1014"/>
         </w:numPr>
         <w:jc w:val="left"/>
       </w:pPr>
@@ -16592,49 +16694,13 @@
         <w:rPr>
           <w:rStyle w:val="VerbatimChar"/>
         </w:rPr>
-        <w:t xml:space="preserve">SCRC_FLT_001</w:t>
-      </w:r>
-      <w:r>
-        <w:t xml:space="preserve"> </w:t>
-      </w:r>
-      <w:r>
-        <w:t xml:space="preserve">A pulse on</w:t>
-      </w:r>
-      <w:r>
-        <w:t xml:space="preserve"> </w:t>
-      </w:r>
-      <w:r>
-        <w:rPr>
-          <w:rStyle w:val="VerbatimChar"/>
-        </w:rPr>
-        <w:t xml:space="preserve">i_rst_n_pad</w:t>
-      </w:r>
-      <w:r>
-        <w:t xml:space="preserve"> </w:t>
-      </w:r>
-      <w:r>
-        <w:t xml:space="preserve">shorter than the three-cell delay does not</w:t>
-      </w:r>
-      <w:r>
-        <w:t xml:space="preserve"> </w:t>
-      </w:r>
-      <w:r>
-        <w:t xml:space="preserve">change</w:t>
-      </w:r>
-      <w:r>
-        <w:t xml:space="preserve"> </w:t>
-      </w:r>
-      <w:r>
-        <w:rPr>
-          <w:rStyle w:val="VerbatimChar"/>
-        </w:rPr>
-        <w:t xml:space="preserve">w_rst_n_por</w:t>
-      </w:r>
-      <w:r>
-        <w:t xml:space="preserve"> </w:t>
-      </w:r>
-      <w:r>
-        <w:t xml:space="preserve">(gate-level simulation with library delays).</w:t>
+        <w:t xml:space="preserve">SCRC_SEQ_002</w:t>
+      </w:r>
+      <w:r>
+        <w:t xml:space="preserve"> </w:t>
+      </w:r>
+      <w:r>
+        <w:t xml:space="preserve">The invariant of 7.6 holds in every cycle (assertion).</w:t>
       </w:r>
     </w:p>
     <w:p>
@@ -16642,7 +16708,7 @@
         <w:pStyle w:val="Compact"/>
         <w:numPr>
           <w:ilvl w:val="0"/>
-          <w:numId w:val="1015"/>
+          <w:numId w:val="1014"/>
         </w:numPr>
         <w:jc w:val="left"/>
       </w:pPr>
@@ -16650,13 +16716,13 @@
         <w:rPr>
           <w:rStyle w:val="VerbatimChar"/>
         </w:rPr>
-        <w:t xml:space="preserve">SCRC_CSR_001</w:t>
-      </w:r>
-      <w:r>
-        <w:t xml:space="preserve"> </w:t>
-      </w:r>
-      <w:r>
-        <w:t xml:space="preserve">Every row of the</w:t>
+        <w:t xml:space="preserve">SCRC_BUS_001</w:t>
+      </w:r>
+      <w:r>
+        <w:t xml:space="preserve"> </w:t>
+      </w:r>
+      <w:r>
+        <w:t xml:space="preserve">An access to a blocked peripheral ends in one transfer with</w:t>
       </w:r>
       <w:r>
         <w:t xml:space="preserve"> </w:t>
@@ -16671,13 +16737,22 @@
         <w:t xml:space="preserve"> </w:t>
       </w:r>
       <w:r>
-        <w:t xml:space="preserve">table (7.4) gives the stated result, and a</w:t>
-      </w:r>
-      <w:r>
-        <w:t xml:space="preserve"> </w:t>
-      </w:r>
-      <w:r>
-        <w:t xml:space="preserve">dropped write changes no register.</w:t>
+        <w:t xml:space="preserve">= 1 and never asserts</w:t>
+      </w:r>
+      <w:r>
+        <w:t xml:space="preserve"> </w:t>
+      </w:r>
+      <w:r>
+        <w:rPr>
+          <w:rStyle w:val="VerbatimChar"/>
+        </w:rPr>
+        <w:t xml:space="preserve">PSEL</w:t>
+      </w:r>
+      <w:r>
+        <w:t xml:space="preserve"> </w:t>
+      </w:r>
+      <w:r>
+        <w:t xml:space="preserve">at the IP.</w:t>
       </w:r>
     </w:p>
     <w:p>
@@ -16685,7 +16760,7 @@
         <w:pStyle w:val="Compact"/>
         <w:numPr>
           <w:ilvl w:val="0"/>
-          <w:numId w:val="1015"/>
+          <w:numId w:val="1014"/>
         </w:numPr>
         <w:jc w:val="left"/>
       </w:pPr>
@@ -16693,19 +16768,28 @@
         <w:rPr>
           <w:rStyle w:val="VerbatimChar"/>
         </w:rPr>
-        <w:t xml:space="preserve">SCRC_CSR_002</w:t>
-      </w:r>
-      <w:r>
-        <w:t xml:space="preserve"> </w:t>
-      </w:r>
-      <w:r>
-        <w:t xml:space="preserve">Reset value, implemented bits and access of every register match</w:t>
-      </w:r>
-      <w:r>
-        <w:t xml:space="preserve"> </w:t>
-      </w:r>
-      <w:r>
-        <w:t xml:space="preserve">section 6, per master.</w:t>
+        <w:t xml:space="preserve">SCRC_BUS_002</w:t>
+      </w:r>
+      <w:r>
+        <w:t xml:space="preserve"> </w:t>
+      </w:r>
+      <w:r>
+        <w:t xml:space="preserve">A change of</w:t>
+      </w:r>
+      <w:r>
+        <w:t xml:space="preserve"> </w:t>
+      </w:r>
+      <w:r>
+        <w:rPr>
+          <w:rStyle w:val="VerbatimChar"/>
+        </w:rPr>
+        <w:t xml:space="preserve">APB_BLK</w:t>
+      </w:r>
+      <w:r>
+        <w:t xml:space="preserve"> </w:t>
+      </w:r>
+      <w:r>
+        <w:t xml:space="preserve">during a transfer does not change its response.</w:t>
       </w:r>
     </w:p>
     <w:p>
@@ -16713,7 +16797,7 @@
         <w:pStyle w:val="Compact"/>
         <w:numPr>
           <w:ilvl w:val="0"/>
-          <w:numId w:val="1015"/>
+          <w:numId w:val="1014"/>
         </w:numPr>
         <w:jc w:val="left"/>
       </w:pPr>
@@ -16721,43 +16805,63 @@
         <w:rPr>
           <w:rStyle w:val="VerbatimChar"/>
         </w:rPr>
-        <w:t xml:space="preserve">SCRC_SEQ_001</w:t>
-      </w:r>
-      <w:r>
-        <w:t xml:space="preserve"> </w:t>
-      </w:r>
-      <w:r>
-        <w:t xml:space="preserve">Any sequence of</w:t>
-      </w:r>
-      <w:r>
-        <w:t xml:space="preserve"> </w:t>
-      </w:r>
-      <w:r>
-        <w:rPr>
-          <w:rStyle w:val="VerbatimChar"/>
-        </w:rPr>
-        <w:t xml:space="preserve">CLK_EN</w:t>
-      </w:r>
-      <w:r>
-        <w:t xml:space="preserve"> </w:t>
-      </w:r>
-      <w:r>
-        <w:t xml:space="preserve">writes, back to back included, ends with</w:t>
-      </w:r>
-      <w:r>
-        <w:t xml:space="preserve"> </w:t>
-      </w:r>
-      <w:r>
-        <w:rPr>
-          <w:rStyle w:val="VerbatimChar"/>
-        </w:rPr>
-        <w:t xml:space="preserve">ICG_EN</w:t>
-      </w:r>
-      <w:r>
-        <w:t xml:space="preserve"> </w:t>
-      </w:r>
-      <w:r>
-        <w:t xml:space="preserve">= the last value written.</w:t>
+        <w:t xml:space="preserve">SCRC_BUS_003</w:t>
+      </w:r>
+      <w:r>
+        <w:t xml:space="preserve"> </w:t>
+      </w:r>
+      <w:r>
+        <w:t xml:space="preserve">With an IP holding</w:t>
+      </w:r>
+      <w:r>
+        <w:t xml:space="preserve"> </w:t>
+      </w:r>
+      <w:r>
+        <w:rPr>
+          <w:rStyle w:val="VerbatimChar"/>
+        </w:rPr>
+        <w:t xml:space="preserve">PREADY</w:t>
+      </w:r>
+      <w:r>
+        <w:t xml:space="preserve"> </w:t>
+      </w:r>
+      <w:r>
+        <w:t xml:space="preserve">low for</w:t>
+      </w:r>
+      <w:r>
+        <w:t xml:space="preserve"> </w:t>
+      </w:r>
+      <w:r>
+        <w:rPr>
+          <w:i/>
+          <w:iCs/>
+        </w:rPr>
+        <w:t xml:space="preserve">N</w:t>
+      </w:r>
+      <w:r>
+        <w:t xml:space="preserve"> </w:t>
+      </w:r>
+      <w:r>
+        <w:t xml:space="preserve">cycles, its clock stops only</w:t>
+      </w:r>
+      <w:r>
+        <w:t xml:space="preserve"> </w:t>
+      </w:r>
+      <w:r>
+        <w:t xml:space="preserve">after the transfer completes, for any</w:t>
+      </w:r>
+      <w:r>
+        <w:t xml:space="preserve"> </w:t>
+      </w:r>
+      <w:r>
+        <w:rPr>
+          <w:i/>
+          <w:iCs/>
+        </w:rPr>
+        <w:t xml:space="preserve">N</w:t>
+      </w:r>
+      <w:r>
+        <w:t xml:space="preserve">.</w:t>
       </w:r>
     </w:p>
     <w:p>
@@ -16765,7 +16869,7 @@
         <w:pStyle w:val="Compact"/>
         <w:numPr>
           <w:ilvl w:val="0"/>
-          <w:numId w:val="1015"/>
+          <w:numId w:val="1014"/>
         </w:numPr>
         <w:jc w:val="left"/>
       </w:pPr>
@@ -16773,13 +16877,70 @@
         <w:rPr>
           <w:rStyle w:val="VerbatimChar"/>
         </w:rPr>
-        <w:t xml:space="preserve">SCRC_SEQ_002</w:t>
-      </w:r>
-      <w:r>
-        <w:t xml:space="preserve"> </w:t>
-      </w:r>
-      <w:r>
-        <w:t xml:space="preserve">The invariant of 7.6 holds in every cycle (assertion).</w:t>
+        <w:t xml:space="preserve">SCRC_DBG_001</w:t>
+      </w:r>
+      <w:r>
+        <w:t xml:space="preserve"> </w:t>
+      </w:r>
+      <w:r>
+        <w:t xml:space="preserve">With</w:t>
+      </w:r>
+      <w:r>
+        <w:t xml:space="preserve"> </w:t>
+      </w:r>
+      <w:r>
+        <w:rPr>
+          <w:rStyle w:val="VerbatimChar"/>
+        </w:rPr>
+        <w:t xml:space="preserve">DBG_EN</w:t>
+      </w:r>
+      <w:r>
+        <w:t xml:space="preserve"> </w:t>
+      </w:r>
+      <w:r>
+        <w:t xml:space="preserve">= 0 the CPU releases as without</w:t>
+      </w:r>
+      <w:r>
+        <w:t xml:space="preserve"> </w:t>
+      </w:r>
+      <w:r>
+        <w:rPr>
+          <w:rStyle w:val="VerbatimChar"/>
+        </w:rPr>
+        <w:t xml:space="preserve">SYSDBG</w:t>
+      </w:r>
+      <w:r>
+        <w:t xml:space="preserve">; with</w:t>
+      </w:r>
+      <w:r>
+        <w:t xml:space="preserve"> </w:t>
+      </w:r>
+      <w:r>
+        <w:rPr>
+          <w:rStyle w:val="VerbatimChar"/>
+        </w:rPr>
+        <w:t xml:space="preserve">DBG_EN</w:t>
+      </w:r>
+      <w:r>
+        <w:t xml:space="preserve"> </w:t>
+      </w:r>
+      <w:r>
+        <w:t xml:space="preserve">= 1 it stays in reset until</w:t>
+      </w:r>
+      <w:r>
+        <w:t xml:space="preserve"> </w:t>
+      </w:r>
+      <w:r>
+        <w:rPr>
+          <w:rStyle w:val="VerbatimChar"/>
+        </w:rPr>
+        <w:t xml:space="preserve">CPUHOLD</w:t>
+      </w:r>
+      <w:r>
+        <w:t xml:space="preserve"> </w:t>
+      </w:r>
+      <w:r>
+        <w:t xml:space="preserve">= 0.</w:t>
       </w:r>
     </w:p>
     <w:p>
@@ -16787,247 +16948,7 @@
         <w:pStyle w:val="Compact"/>
         <w:numPr>
           <w:ilvl w:val="0"/>
-          <w:numId w:val="1015"/>
-        </w:numPr>
-        <w:jc w:val="left"/>
-      </w:pPr>
-      <w:r>
-        <w:rPr>
-          <w:rStyle w:val="VerbatimChar"/>
-        </w:rPr>
-        <w:t xml:space="preserve">SCRC_BUS_001</w:t>
-      </w:r>
-      <w:r>
-        <w:t xml:space="preserve"> </w:t>
-      </w:r>
-      <w:r>
-        <w:t xml:space="preserve">An access to a blocked peripheral ends in one transfer with</w:t>
-      </w:r>
-      <w:r>
-        <w:t xml:space="preserve"> </w:t>
-      </w:r>
-      <w:r>
-        <w:rPr>
-          <w:rStyle w:val="VerbatimChar"/>
-        </w:rPr>
-        <w:t xml:space="preserve">PSLVERR</w:t>
-      </w:r>
-      <w:r>
-        <w:t xml:space="preserve"> </w:t>
-      </w:r>
-      <w:r>
-        <w:t xml:space="preserve">= 1 and never asserts</w:t>
-      </w:r>
-      <w:r>
-        <w:t xml:space="preserve"> </w:t>
-      </w:r>
-      <w:r>
-        <w:rPr>
-          <w:rStyle w:val="VerbatimChar"/>
-        </w:rPr>
-        <w:t xml:space="preserve">PSEL</w:t>
-      </w:r>
-      <w:r>
-        <w:t xml:space="preserve"> </w:t>
-      </w:r>
-      <w:r>
-        <w:t xml:space="preserve">at the IP.</w:t>
-      </w:r>
-    </w:p>
-    <w:p>
-      <w:pPr>
-        <w:pStyle w:val="Compact"/>
-        <w:numPr>
-          <w:ilvl w:val="0"/>
-          <w:numId w:val="1015"/>
-        </w:numPr>
-        <w:jc w:val="left"/>
-      </w:pPr>
-      <w:r>
-        <w:rPr>
-          <w:rStyle w:val="VerbatimChar"/>
-        </w:rPr>
-        <w:t xml:space="preserve">SCRC_BUS_002</w:t>
-      </w:r>
-      <w:r>
-        <w:t xml:space="preserve"> </w:t>
-      </w:r>
-      <w:r>
-        <w:t xml:space="preserve">A change of</w:t>
-      </w:r>
-      <w:r>
-        <w:t xml:space="preserve"> </w:t>
-      </w:r>
-      <w:r>
-        <w:rPr>
-          <w:rStyle w:val="VerbatimChar"/>
-        </w:rPr>
-        <w:t xml:space="preserve">APB_BLK</w:t>
-      </w:r>
-      <w:r>
-        <w:t xml:space="preserve"> </w:t>
-      </w:r>
-      <w:r>
-        <w:t xml:space="preserve">during a transfer does not change its response.</w:t>
-      </w:r>
-    </w:p>
-    <w:p>
-      <w:pPr>
-        <w:pStyle w:val="Compact"/>
-        <w:numPr>
-          <w:ilvl w:val="0"/>
-          <w:numId w:val="1015"/>
-        </w:numPr>
-        <w:jc w:val="left"/>
-      </w:pPr>
-      <w:r>
-        <w:rPr>
-          <w:rStyle w:val="VerbatimChar"/>
-        </w:rPr>
-        <w:t xml:space="preserve">SCRC_BUS_003</w:t>
-      </w:r>
-      <w:r>
-        <w:t xml:space="preserve"> </w:t>
-      </w:r>
-      <w:r>
-        <w:t xml:space="preserve">With an IP holding</w:t>
-      </w:r>
-      <w:r>
-        <w:t xml:space="preserve"> </w:t>
-      </w:r>
-      <w:r>
-        <w:rPr>
-          <w:rStyle w:val="VerbatimChar"/>
-        </w:rPr>
-        <w:t xml:space="preserve">PREADY</w:t>
-      </w:r>
-      <w:r>
-        <w:t xml:space="preserve"> </w:t>
-      </w:r>
-      <w:r>
-        <w:t xml:space="preserve">low for</w:t>
-      </w:r>
-      <w:r>
-        <w:t xml:space="preserve"> </w:t>
-      </w:r>
-      <w:r>
-        <w:rPr>
-          <w:i/>
-          <w:iCs/>
-        </w:rPr>
-        <w:t xml:space="preserve">N</w:t>
-      </w:r>
-      <w:r>
-        <w:t xml:space="preserve"> </w:t>
-      </w:r>
-      <w:r>
-        <w:t xml:space="preserve">cycles, its clock stops only</w:t>
-      </w:r>
-      <w:r>
-        <w:t xml:space="preserve"> </w:t>
-      </w:r>
-      <w:r>
-        <w:t xml:space="preserve">after the transfer completes, for any</w:t>
-      </w:r>
-      <w:r>
-        <w:t xml:space="preserve"> </w:t>
-      </w:r>
-      <w:r>
-        <w:rPr>
-          <w:i/>
-          <w:iCs/>
-        </w:rPr>
-        <w:t xml:space="preserve">N</w:t>
-      </w:r>
-      <w:r>
-        <w:t xml:space="preserve">.</w:t>
-      </w:r>
-    </w:p>
-    <w:p>
-      <w:pPr>
-        <w:pStyle w:val="Compact"/>
-        <w:numPr>
-          <w:ilvl w:val="0"/>
-          <w:numId w:val="1015"/>
-        </w:numPr>
-        <w:jc w:val="left"/>
-      </w:pPr>
-      <w:r>
-        <w:rPr>
-          <w:rStyle w:val="VerbatimChar"/>
-        </w:rPr>
-        <w:t xml:space="preserve">SCRC_DBG_001</w:t>
-      </w:r>
-      <w:r>
-        <w:t xml:space="preserve"> </w:t>
-      </w:r>
-      <w:r>
-        <w:t xml:space="preserve">With</w:t>
-      </w:r>
-      <w:r>
-        <w:t xml:space="preserve"> </w:t>
-      </w:r>
-      <w:r>
-        <w:rPr>
-          <w:rStyle w:val="VerbatimChar"/>
-        </w:rPr>
-        <w:t xml:space="preserve">DBG_EN</w:t>
-      </w:r>
-      <w:r>
-        <w:t xml:space="preserve"> </w:t>
-      </w:r>
-      <w:r>
-        <w:t xml:space="preserve">= 0 the CPU releases as without</w:t>
-      </w:r>
-      <w:r>
-        <w:t xml:space="preserve"> </w:t>
-      </w:r>
-      <w:r>
-        <w:rPr>
-          <w:rStyle w:val="VerbatimChar"/>
-        </w:rPr>
-        <w:t xml:space="preserve">SYSDBG</w:t>
-      </w:r>
-      <w:r>
-        <w:t xml:space="preserve">; with</w:t>
-      </w:r>
-      <w:r>
-        <w:t xml:space="preserve"> </w:t>
-      </w:r>
-      <w:r>
-        <w:rPr>
-          <w:rStyle w:val="VerbatimChar"/>
-        </w:rPr>
-        <w:t xml:space="preserve">DBG_EN</w:t>
-      </w:r>
-      <w:r>
-        <w:t xml:space="preserve"> </w:t>
-      </w:r>
-      <w:r>
-        <w:t xml:space="preserve">= 1 it stays in reset until</w:t>
-      </w:r>
-      <w:r>
-        <w:t xml:space="preserve"> </w:t>
-      </w:r>
-      <w:r>
-        <w:rPr>
-          <w:rStyle w:val="VerbatimChar"/>
-        </w:rPr>
-        <w:t xml:space="preserve">CPUHOLD</w:t>
-      </w:r>
-      <w:r>
-        <w:t xml:space="preserve"> </w:t>
-      </w:r>
-      <w:r>
-        <w:t xml:space="preserve">= 0.</w:t>
-      </w:r>
-    </w:p>
-    <w:p>
-      <w:pPr>
-        <w:pStyle w:val="Compact"/>
-        <w:numPr>
-          <w:ilvl w:val="0"/>
-          <w:numId w:val="1015"/>
+          <w:numId w:val="1014"/>
         </w:numPr>
         <w:jc w:val="left"/>
       </w:pPr>
@@ -18106,56 +18027,78 @@
               <w:jc w:val="left"/>
             </w:pPr>
             <w:r>
-              <w:t xml:space="preserve">POR stretch:</w:t>
-            </w:r>
-            <w:r>
-              <w:t xml:space="preserve"> </w:t>
-            </w:r>
-            <w:r>
-              <w:rPr>
-                <w:rStyle w:val="VerbatimChar"/>
-              </w:rPr>
-              <w:t xml:space="preserve">CNT</w:t>
-            </w:r>
-            <w:r>
-              <w:t xml:space="preserve"> </w:t>
-            </w:r>
-            <w:r>
-              <w:t xml:space="preserve">and flip-flop reset values</w:t>
-            </w:r>
-          </w:p>
-        </w:tc>
-        <w:tc>
-          <w:tcPr/>
-          <w:p>
-            <w:pPr>
-              <w:pStyle w:val="Compact"/>
-              <w:jc w:val="left"/>
-            </w:pPr>
-            <w:r>
-              <w:t xml:space="preserve">lead, V3.0</w:t>
-            </w:r>
-          </w:p>
-        </w:tc>
-        <w:tc>
-          <w:tcPr/>
-          <w:p>
-            <w:pPr>
-              <w:pStyle w:val="Compact"/>
-              <w:jc w:val="left"/>
-            </w:pPr>
-            <w:r>
-              <w:t xml:space="preserve">7.3;</w:t>
-            </w:r>
-            <w:r>
-              <w:t xml:space="preserve"> </w:t>
-            </w:r>
-            <w:r>
-              <w:rPr>
-                <w:b/>
-                <w:bCs/>
-              </w:rPr>
-              <w:t xml:space="preserve">owner to confirm</w:t>
+              <w:t xml:space="preserve">No stretch after POR</w:t>
+            </w:r>
+          </w:p>
+        </w:tc>
+        <w:tc>
+          <w:tcPr/>
+          <w:p>
+            <w:pPr>
+              <w:pStyle w:val="Compact"/>
+              <w:jc w:val="left"/>
+            </w:pPr>
+            <w:r>
+              <w:t xml:space="preserve">lead proposal, adopted by the owner</w:t>
+            </w:r>
+          </w:p>
+        </w:tc>
+        <w:tc>
+          <w:tcPr/>
+          <w:p>
+            <w:pPr>
+              <w:pStyle w:val="Compact"/>
+              <w:jc w:val="left"/>
+            </w:pPr>
+            <w:r>
+              <w:t xml:space="preserve">7.3,</w:t>
+            </w:r>
+            <w:r>
+              <w:t xml:space="preserve"> </w:t>
+            </w:r>
+            <w:r>
+              <w:rPr>
+                <w:rStyle w:val="VerbatimChar"/>
+              </w:rPr>
+              <w:t xml:space="preserve">SCRC_RST_001</w:t>
+            </w:r>
+          </w:p>
+        </w:tc>
+      </w:tr>
+      <w:tr>
+        <w:tc>
+          <w:tcPr/>
+          <w:p>
+            <w:pPr>
+              <w:pStyle w:val="Compact"/>
+              <w:jc w:val="left"/>
+            </w:pPr>
+            <w:r>
+              <w:t xml:space="preserve">Two CSRs instead of APB BUS + WFs</w:t>
+            </w:r>
+          </w:p>
+        </w:tc>
+        <w:tc>
+          <w:tcPr/>
+          <w:p>
+            <w:pPr>
+              <w:pStyle w:val="Compact"/>
+              <w:jc w:val="left"/>
+            </w:pPr>
+            <w:r>
+              <w:t xml:space="preserve">lead proposal</w:t>
+            </w:r>
+          </w:p>
+        </w:tc>
+        <w:tc>
+          <w:tcPr/>
+          <w:p>
+            <w:pPr>
+              <w:pStyle w:val="Compact"/>
+              <w:jc w:val="left"/>
+            </w:pPr>
+            <w:r>
+              <w:t xml:space="preserve">Rejected by the owner: the mentor’s design stays, DECISIONS 4</w:t>
             </w:r>
           </w:p>
         </w:tc>
@@ -18628,7 +18571,7 @@
       <w:rPr>
         <w:szCs w:val="26"/>
       </w:rPr>
-      <w:t>V3.0</w:t>
+      <w:t>V3.1</w:t>
     </w:r>
     <w:r>
       <w:rPr>
@@ -20571,9 +20514,6 @@
     <w:abstractNumId w:val="991"/>
   </w:num>
   <w:num w:numId="1014">
-    <w:abstractNumId w:val="991"/>
-  </w:num>
-  <w:num w:numId="1015">
     <w:abstractNumId w:val="99411"/>
     <w:lvlOverride w:ilvl="0">
       <w:startOverride w:val="1"/>

</xml_diff>

<commit_message>
docs(dma): v3.2 from vinh's review of v3.1
Every finding re-checked in the vendored iDMA before adoption:
- register map: the 2D group is 16-byte aligned, so DST_STRIDE, SRC_STRIDE,
  REPS, COMPUTE_CFG are at 0xE0-0xEC and 0xDC is empty (systemrdl-compiler
  on idma_reg.rdl); NEXT_ID resets to 2, DONE_ID to 1
- job IDs retire on the midend response, once per job, not per 1D transfer
- the idle level rises before the last write response: idle is not done
- LENGTH = 0 and REPS = 0 behaviour; compute.svh generated; error-handler
  ports tied off; BufferDepth 3; COMPUTE_CFG kept 0; tests DMA_010-013

SCRC V3.2: before gating dma, wait for DONE_ID, not idle. Contract note on
line 0 says the same. The review is kept in QNSC_DMA_DECISIONS section 2.
</commit_message>
<xml_diff>
--- a/doc/specs/docx/QNSC_SCRC_MAS.docx
+++ b/doc/specs/docx/QNSC_SCRC_MAS.docx
@@ -15,7 +15,7 @@
         <w:pStyle w:val="Subtitle"/>
       </w:pPr>
       <w:r>
-        <w:t xml:space="preserve">MICRO-ARCHITECTURE SPECIFICATION – V3.1</w:t>
+        <w:t xml:space="preserve">MICRO-ARCHITECTURE SPECIFICATION – V3.2</w:t>
       </w:r>
     </w:p>
     <w:p>
@@ -677,6 +677,104 @@
           </w:p>
         </w:tc>
       </w:tr>
+      <w:tr>
+        <w:tc>
+          <w:tcPr/>
+          <w:p>
+            <w:pPr>
+              <w:pStyle w:val="Compact"/>
+              <w:jc w:val="left"/>
+            </w:pPr>
+            <w:r>
+              <w:t xml:space="preserve">V3.2</w:t>
+            </w:r>
+          </w:p>
+        </w:tc>
+        <w:tc>
+          <w:tcPr/>
+          <w:p>
+            <w:pPr>
+              <w:pStyle w:val="Compact"/>
+              <w:jc w:val="left"/>
+            </w:pPr>
+            <w:r>
+              <w:t xml:space="preserve">2026-09-29</w:t>
+            </w:r>
+          </w:p>
+        </w:tc>
+        <w:tc>
+          <w:tcPr/>
+          <w:p>
+            <w:pPr>
+              <w:pStyle w:val="Compact"/>
+              <w:jc w:val="left"/>
+            </w:pPr>
+            <w:r>
+              <w:t xml:space="preserve">Nghia VT (lead)</w:t>
+            </w:r>
+          </w:p>
+        </w:tc>
+        <w:tc>
+          <w:tcPr/>
+          <w:p>
+            <w:pPr>
+              <w:pStyle w:val="Compact"/>
+              <w:jc w:val="left"/>
+            </w:pPr>
+            <w:r>
+              <w:t xml:space="preserve">–</w:t>
+            </w:r>
+          </w:p>
+        </w:tc>
+        <w:tc>
+          <w:tcPr/>
+          <w:p>
+            <w:pPr>
+              <w:pStyle w:val="Compact"/>
+              <w:jc w:val="left"/>
+            </w:pPr>
+            <w:r>
+              <w:t xml:space="preserve">7.10: before gating</w:t>
+            </w:r>
+            <w:r>
+              <w:t xml:space="preserve"> </w:t>
+            </w:r>
+            <w:r>
+              <w:rPr>
+                <w:rStyle w:val="VerbatimChar"/>
+              </w:rPr>
+              <w:t xml:space="preserve">dma</w:t>
+            </w:r>
+            <w:r>
+              <w:t xml:space="preserve">, wait for</w:t>
+            </w:r>
+            <w:r>
+              <w:t xml:space="preserve"> </w:t>
+            </w:r>
+            <w:r>
+              <w:rPr>
+                <w:rStyle w:val="VerbatimChar"/>
+              </w:rPr>
+              <w:t xml:space="preserve">DONE_ID</w:t>
+            </w:r>
+            <w:r>
+              <w:t xml:space="preserve">, not idle (</w:t>
+            </w:r>
+            <w:r>
+              <w:rPr>
+                <w:rStyle w:val="VerbatimChar"/>
+              </w:rPr>
+              <w:t xml:space="preserve">QNSC_DMA_MAS</w:t>
+            </w:r>
+            <w:r>
+              <w:t xml:space="preserve"> </w:t>
+            </w:r>
+            <w:r>
+              <w:t xml:space="preserve">V3.2)</w:t>
+            </w:r>
+          </w:p>
+        </w:tc>
+      </w:tr>
     </w:tbl>
     <w:bookmarkEnd w:id="26"/>
     <w:bookmarkStart w:id="27" w:name="overview"/>
@@ -12951,7 +13049,40 @@
         <w:t xml:space="preserve">dma</w:t>
       </w:r>
       <w:r>
-        <w:t xml:space="preserve">, wait until the DMA is idle.</w:t>
+        <w:t xml:space="preserve">, wait until</w:t>
+      </w:r>
+      <w:r>
+        <w:t xml:space="preserve"> </w:t>
+      </w:r>
+      <w:r>
+        <w:rPr>
+          <w:rStyle w:val="VerbatimChar"/>
+        </w:rPr>
+        <w:t xml:space="preserve">DONE_ID</w:t>
+      </w:r>
+      <w:r>
+        <w:t xml:space="preserve"> </w:t>
+      </w:r>
+      <w:r>
+        <w:t xml:space="preserve">reaches the last launched job: the DMA reports</w:t>
+      </w:r>
+      <w:r>
+        <w:t xml:space="preserve"> </w:t>
+      </w:r>
+      <w:r>
+        <w:t xml:space="preserve">idle before its last write response (</w:t>
+      </w:r>
+      <w:r>
+        <w:rPr>
+          <w:rStyle w:val="VerbatimChar"/>
+        </w:rPr>
+        <w:t xml:space="preserve">QNSC_DMA_MAS</w:t>
+      </w:r>
+      <w:r>
+        <w:t xml:space="preserve"> </w:t>
+      </w:r>
+      <w:r>
+        <w:t xml:space="preserve">7.4).</w:t>
       </w:r>
     </w:p>
     <w:bookmarkEnd w:id="78"/>
@@ -18571,7 +18702,7 @@
       <w:rPr>
         <w:szCs w:val="26"/>
       </w:rPr>
-      <w:t>V3.1</w:t>
+      <w:t>V3.2</w:t>
     </w:r>
     <w:r>
       <w:rPr>

</xml_diff>

<commit_message>
docs(dma): v3.2 from vinh's review of v3.1 (#54)
Every finding re-checked in the vendored iDMA before adoption:
- register map: the 2D group is 16-byte aligned, so DST_STRIDE, SRC_STRIDE,
  REPS, COMPUTE_CFG are at 0xE0-0xEC and 0xDC is empty (systemrdl-compiler
  on idma_reg.rdl); NEXT_ID resets to 2, DONE_ID to 1
- job IDs retire on the midend response, once per job, not per 1D transfer
- the idle level rises before the last write response: idle is not done
- LENGTH = 0 and REPS = 0 behaviour; compute.svh generated; error-handler
  ports tied off; BufferDepth 3; COMPUTE_CFG kept 0; tests DMA_010-013

SCRC V3.2: before gating dma, wait for DONE_ID, not idle. Contract note on
line 0 says the same. The review is kept in QNSC_DMA_DECISIONS section 2.
</commit_message>
<xml_diff>
--- a/doc/specs/docx/QNSC_SCRC_MAS.docx
+++ b/doc/specs/docx/QNSC_SCRC_MAS.docx
@@ -15,7 +15,7 @@
         <w:pStyle w:val="Subtitle"/>
       </w:pPr>
       <w:r>
-        <w:t xml:space="preserve">MICRO-ARCHITECTURE SPECIFICATION – V3.1</w:t>
+        <w:t xml:space="preserve">MICRO-ARCHITECTURE SPECIFICATION – V3.2</w:t>
       </w:r>
     </w:p>
     <w:p>
@@ -677,6 +677,104 @@
           </w:p>
         </w:tc>
       </w:tr>
+      <w:tr>
+        <w:tc>
+          <w:tcPr/>
+          <w:p>
+            <w:pPr>
+              <w:pStyle w:val="Compact"/>
+              <w:jc w:val="left"/>
+            </w:pPr>
+            <w:r>
+              <w:t xml:space="preserve">V3.2</w:t>
+            </w:r>
+          </w:p>
+        </w:tc>
+        <w:tc>
+          <w:tcPr/>
+          <w:p>
+            <w:pPr>
+              <w:pStyle w:val="Compact"/>
+              <w:jc w:val="left"/>
+            </w:pPr>
+            <w:r>
+              <w:t xml:space="preserve">2026-09-29</w:t>
+            </w:r>
+          </w:p>
+        </w:tc>
+        <w:tc>
+          <w:tcPr/>
+          <w:p>
+            <w:pPr>
+              <w:pStyle w:val="Compact"/>
+              <w:jc w:val="left"/>
+            </w:pPr>
+            <w:r>
+              <w:t xml:space="preserve">Nghia VT (lead)</w:t>
+            </w:r>
+          </w:p>
+        </w:tc>
+        <w:tc>
+          <w:tcPr/>
+          <w:p>
+            <w:pPr>
+              <w:pStyle w:val="Compact"/>
+              <w:jc w:val="left"/>
+            </w:pPr>
+            <w:r>
+              <w:t xml:space="preserve">–</w:t>
+            </w:r>
+          </w:p>
+        </w:tc>
+        <w:tc>
+          <w:tcPr/>
+          <w:p>
+            <w:pPr>
+              <w:pStyle w:val="Compact"/>
+              <w:jc w:val="left"/>
+            </w:pPr>
+            <w:r>
+              <w:t xml:space="preserve">7.10: before gating</w:t>
+            </w:r>
+            <w:r>
+              <w:t xml:space="preserve"> </w:t>
+            </w:r>
+            <w:r>
+              <w:rPr>
+                <w:rStyle w:val="VerbatimChar"/>
+              </w:rPr>
+              <w:t xml:space="preserve">dma</w:t>
+            </w:r>
+            <w:r>
+              <w:t xml:space="preserve">, wait for</w:t>
+            </w:r>
+            <w:r>
+              <w:t xml:space="preserve"> </w:t>
+            </w:r>
+            <w:r>
+              <w:rPr>
+                <w:rStyle w:val="VerbatimChar"/>
+              </w:rPr>
+              <w:t xml:space="preserve">DONE_ID</w:t>
+            </w:r>
+            <w:r>
+              <w:t xml:space="preserve">, not idle (</w:t>
+            </w:r>
+            <w:r>
+              <w:rPr>
+                <w:rStyle w:val="VerbatimChar"/>
+              </w:rPr>
+              <w:t xml:space="preserve">QNSC_DMA_MAS</w:t>
+            </w:r>
+            <w:r>
+              <w:t xml:space="preserve"> </w:t>
+            </w:r>
+            <w:r>
+              <w:t xml:space="preserve">V3.2)</w:t>
+            </w:r>
+          </w:p>
+        </w:tc>
+      </w:tr>
     </w:tbl>
     <w:bookmarkEnd w:id="26"/>
     <w:bookmarkStart w:id="27" w:name="overview"/>
@@ -12951,7 +13049,40 @@
         <w:t xml:space="preserve">dma</w:t>
       </w:r>
       <w:r>
-        <w:t xml:space="preserve">, wait until the DMA is idle.</w:t>
+        <w:t xml:space="preserve">, wait until</w:t>
+      </w:r>
+      <w:r>
+        <w:t xml:space="preserve"> </w:t>
+      </w:r>
+      <w:r>
+        <w:rPr>
+          <w:rStyle w:val="VerbatimChar"/>
+        </w:rPr>
+        <w:t xml:space="preserve">DONE_ID</w:t>
+      </w:r>
+      <w:r>
+        <w:t xml:space="preserve"> </w:t>
+      </w:r>
+      <w:r>
+        <w:t xml:space="preserve">reaches the last launched job: the DMA reports</w:t>
+      </w:r>
+      <w:r>
+        <w:t xml:space="preserve"> </w:t>
+      </w:r>
+      <w:r>
+        <w:t xml:space="preserve">idle before its last write response (</w:t>
+      </w:r>
+      <w:r>
+        <w:rPr>
+          <w:rStyle w:val="VerbatimChar"/>
+        </w:rPr>
+        <w:t xml:space="preserve">QNSC_DMA_MAS</w:t>
+      </w:r>
+      <w:r>
+        <w:t xml:space="preserve"> </w:t>
+      </w:r>
+      <w:r>
+        <w:t xml:space="preserve">7.4).</w:t>
       </w:r>
     </w:p>
     <w:bookmarkEnd w:id="78"/>
@@ -18571,7 +18702,7 @@
       <w:rPr>
         <w:szCs w:val="26"/>
       </w:rPr>
-      <w:t>V3.1</w:t>
+      <w:t>V3.2</w:t>
     </w:r>
     <w:r>
       <w:rPr>

</xml_diff>